<commit_message>
nội dung phân công tuần 1
</commit_message>
<xml_diff>
--- a/DOCX/QA_Test_Report_UDM10 tuần 1.docx
+++ b/DOCX/QA_Test_Report_UDM10 tuần 1.docx
@@ -1796,9 +1796,3176 @@
         <w:t xml:space="preserve">Hình 5: Server log đầy đủ New client connected / Upload completed / Connection closed.</w:t>
       </w:r>
     </w:p>
+    <w:p>
+      <w:pPr>
+        <w:sectPr>
+          <w:pgSz w:w="11906" w:h="16838" w:orient="portrait"/>
+          <w:pgMar w:top="1440" w:right="1440" w:bottom="1440" w:left="1440" w:header="708" w:footer="708" w:gutter="0"/>
+          <w:pgNumType/>
+          <w:docGrid w:linePitch="360"/>
+        </w:sectPr>
+      </w:pPr>
+    </w:p>
+    <w:p>
+      <w:pPr>
+        <w:spacing w:after="120"/>
+      </w:pPr>
+      <w:r>
+        <w:rPr>
+          <w:rFonts w:ascii="Times New Roman" w:hAnsi="Times New Roman" w:eastAsia="Times New Roman"/>
+          <w:b/>
+          <w:i w:val="0"/>
+          <w:sz w:val="32"/>
+        </w:rPr>
+        <w:t>6. Phân công công việc tuần 1</w:t>
+      </w:r>
+    </w:p>
+    <w:p>
+      <w:pPr>
+        <w:spacing w:after="120"/>
+      </w:pPr>
+      <w:r>
+        <w:rPr>
+          <w:rFonts w:ascii="Times New Roman" w:hAnsi="Times New Roman" w:eastAsia="Times New Roman"/>
+          <w:b w:val="0"/>
+          <w:i/>
+          <w:sz w:val="20"/>
+        </w:rPr>
+        <w:t>Nguồn: bảng phân công trong file LTM_PROJECT(tuần 1).xlsx, sheet “Tuần 1(18-78)”.</w:t>
+      </w:r>
+    </w:p>
+    <w:p>
+      <w:pPr>
+        <w:spacing w:before="80" w:after="60"/>
+      </w:pPr>
+      <w:r>
+        <w:rPr>
+          <w:rFonts w:ascii="Times New Roman" w:hAnsi="Times New Roman" w:eastAsia="Times New Roman"/>
+          <w:b/>
+          <w:i w:val="0"/>
+          <w:sz w:val="22"/>
+        </w:rPr>
+        <w:t>Bảng 1. Tóm tắt phân công</w:t>
+      </w:r>
+    </w:p>
+    <w:tbl>
+      <w:tblPr>
+        <w:tblW w:type="auto" w:w="0"/>
+        <w:jc w:val="center"/>
+        <w:tblLook w:firstColumn="1" w:firstRow="1" w:lastColumn="0" w:lastRow="0" w:noHBand="0" w:noVBand="1" w:val="04A0"/>
+      </w:tblPr>
+      <w:tblGrid>
+        <w:gridCol w:w="2211"/>
+        <w:gridCol w:w="2211"/>
+        <w:gridCol w:w="2211"/>
+        <w:gridCol w:w="2211"/>
+        <w:gridCol w:w="2211"/>
+        <w:gridCol w:w="2211"/>
+        <w:gridCol w:w="2211"/>
+      </w:tblGrid>
+      <w:tr>
+        <w:tc>
+          <w:tcPr>
+            <w:tcW w:type="dxa" w:w="2154"/>
+            <w:vAlign w:val="center"/>
+            <w:tcMar>
+              <w:top w:w="80" w:type="dxa"/>
+              <w:start w:w="80" w:type="dxa"/>
+              <w:bottom w:w="80" w:type="dxa"/>
+              <w:end w:w="80" w:type="dxa"/>
+            </w:tcMar>
+            <w:tcBorders>
+              <w:top w:val="single" w:sz="6" w:space="0" w:color="7F7F7F"/>
+              <w:left w:val="single" w:sz="6" w:space="0" w:color="7F7F7F"/>
+              <w:bottom w:val="single" w:sz="6" w:space="0" w:color="7F7F7F"/>
+              <w:right w:val="single" w:sz="6" w:space="0" w:color="7F7F7F"/>
+              <w:insideH w:val="single" w:sz="6" w:space="0" w:color="7F7F7F"/>
+              <w:insideV w:val="single" w:sz="6" w:space="0" w:color="7F7F7F"/>
+            </w:tcBorders>
+            <w:shd w:fill="1F4E79"/>
+          </w:tcPr>
+          <w:p>
+            <w:pPr>
+              <w:spacing w:after="0"/>
+              <w:jc w:val="center"/>
+            </w:pPr>
+            <w:r>
+              <w:rPr>
+                <w:rFonts w:ascii="Times New Roman" w:hAnsi="Times New Roman" w:eastAsia="Times New Roman"/>
+                <w:b/>
+                <w:i w:val="0"/>
+                <w:color w:val="FFFFFF"/>
+                <w:sz w:val="16"/>
+              </w:rPr>
+            </w:r>
+            <w:r>
+              <w:rPr>
+                <w:rFonts w:ascii="Times New Roman" w:hAnsi="Times New Roman" w:eastAsia="Times New Roman"/>
+                <w:b/>
+                <w:i w:val="0"/>
+                <w:color w:val="FFFFFF"/>
+                <w:sz w:val="16"/>
+              </w:rPr>
+              <w:t>Role/feature phụ trách</w:t>
+            </w:r>
+          </w:p>
+        </w:tc>
+        <w:tc>
+          <w:tcPr>
+            <w:tcW w:type="dxa" w:w="1304"/>
+            <w:vAlign w:val="center"/>
+            <w:tcMar>
+              <w:top w:w="80" w:type="dxa"/>
+              <w:start w:w="80" w:type="dxa"/>
+              <w:bottom w:w="80" w:type="dxa"/>
+              <w:end w:w="80" w:type="dxa"/>
+            </w:tcMar>
+            <w:tcBorders>
+              <w:top w:val="single" w:sz="6" w:space="0" w:color="7F7F7F"/>
+              <w:left w:val="single" w:sz="6" w:space="0" w:color="7F7F7F"/>
+              <w:bottom w:val="single" w:sz="6" w:space="0" w:color="7F7F7F"/>
+              <w:right w:val="single" w:sz="6" w:space="0" w:color="7F7F7F"/>
+              <w:insideH w:val="single" w:sz="6" w:space="0" w:color="7F7F7F"/>
+              <w:insideV w:val="single" w:sz="6" w:space="0" w:color="7F7F7F"/>
+            </w:tcBorders>
+            <w:shd w:fill="1F4E79"/>
+          </w:tcPr>
+          <w:p>
+            <w:pPr>
+              <w:spacing w:after="0"/>
+              <w:jc w:val="center"/>
+            </w:pPr>
+            <w:r>
+              <w:rPr>
+                <w:rFonts w:ascii="Times New Roman" w:hAnsi="Times New Roman" w:eastAsia="Times New Roman"/>
+                <w:b/>
+                <w:i w:val="0"/>
+                <w:color w:val="FFFFFF"/>
+                <w:sz w:val="16"/>
+              </w:rPr>
+            </w:r>
+            <w:r>
+              <w:rPr>
+                <w:rFonts w:ascii="Times New Roman" w:hAnsi="Times New Roman" w:eastAsia="Times New Roman"/>
+                <w:b/>
+                <w:i w:val="0"/>
+                <w:color w:val="FFFFFF"/>
+                <w:sz w:val="16"/>
+              </w:rPr>
+              <w:t>Người thực hiện</w:t>
+            </w:r>
+          </w:p>
+        </w:tc>
+        <w:tc>
+          <w:tcPr>
+            <w:tcW w:type="dxa" w:w="680"/>
+            <w:vAlign w:val="center"/>
+            <w:tcMar>
+              <w:top w:w="80" w:type="dxa"/>
+              <w:start w:w="80" w:type="dxa"/>
+              <w:bottom w:w="80" w:type="dxa"/>
+              <w:end w:w="80" w:type="dxa"/>
+            </w:tcMar>
+            <w:tcBorders>
+              <w:top w:val="single" w:sz="6" w:space="0" w:color="7F7F7F"/>
+              <w:left w:val="single" w:sz="6" w:space="0" w:color="7F7F7F"/>
+              <w:bottom w:val="single" w:sz="6" w:space="0" w:color="7F7F7F"/>
+              <w:right w:val="single" w:sz="6" w:space="0" w:color="7F7F7F"/>
+              <w:insideH w:val="single" w:sz="6" w:space="0" w:color="7F7F7F"/>
+              <w:insideV w:val="single" w:sz="6" w:space="0" w:color="7F7F7F"/>
+            </w:tcBorders>
+            <w:shd w:fill="1F4E79"/>
+          </w:tcPr>
+          <w:p>
+            <w:pPr>
+              <w:spacing w:after="0"/>
+              <w:jc w:val="center"/>
+            </w:pPr>
+            <w:r>
+              <w:rPr>
+                <w:rFonts w:ascii="Times New Roman" w:hAnsi="Times New Roman" w:eastAsia="Times New Roman"/>
+                <w:b/>
+                <w:i w:val="0"/>
+                <w:color w:val="FFFFFF"/>
+                <w:sz w:val="16"/>
+              </w:rPr>
+            </w:r>
+            <w:r>
+              <w:rPr>
+                <w:rFonts w:ascii="Times New Roman" w:hAnsi="Times New Roman" w:eastAsia="Times New Roman"/>
+                <w:b/>
+                <w:i w:val="0"/>
+                <w:color w:val="FFFFFF"/>
+                <w:sz w:val="16"/>
+              </w:rPr>
+              <w:t>Ưu tiên</w:t>
+            </w:r>
+          </w:p>
+        </w:tc>
+        <w:tc>
+          <w:tcPr>
+            <w:tcW w:type="dxa" w:w="1190"/>
+            <w:vAlign w:val="center"/>
+            <w:tcMar>
+              <w:top w:w="80" w:type="dxa"/>
+              <w:start w:w="80" w:type="dxa"/>
+              <w:bottom w:w="80" w:type="dxa"/>
+              <w:end w:w="80" w:type="dxa"/>
+            </w:tcMar>
+            <w:tcBorders>
+              <w:top w:val="single" w:sz="6" w:space="0" w:color="7F7F7F"/>
+              <w:left w:val="single" w:sz="6" w:space="0" w:color="7F7F7F"/>
+              <w:bottom w:val="single" w:sz="6" w:space="0" w:color="7F7F7F"/>
+              <w:right w:val="single" w:sz="6" w:space="0" w:color="7F7F7F"/>
+              <w:insideH w:val="single" w:sz="6" w:space="0" w:color="7F7F7F"/>
+              <w:insideV w:val="single" w:sz="6" w:space="0" w:color="7F7F7F"/>
+            </w:tcBorders>
+            <w:shd w:fill="1F4E79"/>
+          </w:tcPr>
+          <w:p>
+            <w:pPr>
+              <w:spacing w:after="0"/>
+              <w:jc w:val="center"/>
+            </w:pPr>
+            <w:r>
+              <w:rPr>
+                <w:rFonts w:ascii="Times New Roman" w:hAnsi="Times New Roman" w:eastAsia="Times New Roman"/>
+                <w:b/>
+                <w:i w:val="0"/>
+                <w:color w:val="FFFFFF"/>
+                <w:sz w:val="16"/>
+              </w:rPr>
+            </w:r>
+            <w:r>
+              <w:rPr>
+                <w:rFonts w:ascii="Times New Roman" w:hAnsi="Times New Roman" w:eastAsia="Times New Roman"/>
+                <w:b/>
+                <w:i w:val="0"/>
+                <w:color w:val="FFFFFF"/>
+                <w:sz w:val="16"/>
+              </w:rPr>
+              <w:t>Trạng thái</w:t>
+            </w:r>
+          </w:p>
+        </w:tc>
+        <w:tc>
+          <w:tcPr>
+            <w:tcW w:type="dxa" w:w="1474"/>
+            <w:vAlign w:val="center"/>
+            <w:tcMar>
+              <w:top w:w="80" w:type="dxa"/>
+              <w:start w:w="80" w:type="dxa"/>
+              <w:bottom w:w="80" w:type="dxa"/>
+              <w:end w:w="80" w:type="dxa"/>
+            </w:tcMar>
+            <w:tcBorders>
+              <w:top w:val="single" w:sz="6" w:space="0" w:color="7F7F7F"/>
+              <w:left w:val="single" w:sz="6" w:space="0" w:color="7F7F7F"/>
+              <w:bottom w:val="single" w:sz="6" w:space="0" w:color="7F7F7F"/>
+              <w:right w:val="single" w:sz="6" w:space="0" w:color="7F7F7F"/>
+              <w:insideH w:val="single" w:sz="6" w:space="0" w:color="7F7F7F"/>
+              <w:insideV w:val="single" w:sz="6" w:space="0" w:color="7F7F7F"/>
+            </w:tcBorders>
+            <w:shd w:fill="1F4E79"/>
+          </w:tcPr>
+          <w:p>
+            <w:pPr>
+              <w:spacing w:after="0"/>
+              <w:jc w:val="center"/>
+            </w:pPr>
+            <w:r>
+              <w:rPr>
+                <w:rFonts w:ascii="Times New Roman" w:hAnsi="Times New Roman" w:eastAsia="Times New Roman"/>
+                <w:b/>
+                <w:i w:val="0"/>
+                <w:color w:val="FFFFFF"/>
+                <w:sz w:val="16"/>
+              </w:rPr>
+            </w:r>
+            <w:r>
+              <w:rPr>
+                <w:rFonts w:ascii="Times New Roman" w:hAnsi="Times New Roman" w:eastAsia="Times New Roman"/>
+                <w:b/>
+                <w:i w:val="0"/>
+                <w:color w:val="FFFFFF"/>
+                <w:sz w:val="16"/>
+              </w:rPr>
+              <w:t>Thời gian</w:t>
+            </w:r>
+          </w:p>
+        </w:tc>
+        <w:tc>
+          <w:tcPr>
+            <w:tcW w:type="dxa" w:w="3061"/>
+            <w:vAlign w:val="center"/>
+            <w:tcMar>
+              <w:top w:w="80" w:type="dxa"/>
+              <w:start w:w="80" w:type="dxa"/>
+              <w:bottom w:w="80" w:type="dxa"/>
+              <w:end w:w="80" w:type="dxa"/>
+            </w:tcMar>
+            <w:tcBorders>
+              <w:top w:val="single" w:sz="6" w:space="0" w:color="7F7F7F"/>
+              <w:left w:val="single" w:sz="6" w:space="0" w:color="7F7F7F"/>
+              <w:bottom w:val="single" w:sz="6" w:space="0" w:color="7F7F7F"/>
+              <w:right w:val="single" w:sz="6" w:space="0" w:color="7F7F7F"/>
+              <w:insideH w:val="single" w:sz="6" w:space="0" w:color="7F7F7F"/>
+              <w:insideV w:val="single" w:sz="6" w:space="0" w:color="7F7F7F"/>
+            </w:tcBorders>
+            <w:shd w:fill="1F4E79"/>
+          </w:tcPr>
+          <w:p>
+            <w:pPr>
+              <w:spacing w:after="0"/>
+              <w:jc w:val="center"/>
+            </w:pPr>
+            <w:r>
+              <w:rPr>
+                <w:rFonts w:ascii="Times New Roman" w:hAnsi="Times New Roman" w:eastAsia="Times New Roman"/>
+                <w:b/>
+                <w:i w:val="0"/>
+                <w:color w:val="FFFFFF"/>
+                <w:sz w:val="16"/>
+              </w:rPr>
+            </w:r>
+            <w:r>
+              <w:rPr>
+                <w:rFonts w:ascii="Times New Roman" w:hAnsi="Times New Roman" w:eastAsia="Times New Roman"/>
+                <w:b/>
+                <w:i w:val="0"/>
+                <w:color w:val="FFFFFF"/>
+                <w:sz w:val="16"/>
+              </w:rPr>
+              <w:t>File cần đọc/làm</w:t>
+            </w:r>
+          </w:p>
+        </w:tc>
+        <w:tc>
+          <w:tcPr>
+            <w:tcW w:type="dxa" w:w="2664"/>
+            <w:vAlign w:val="center"/>
+            <w:tcMar>
+              <w:top w:w="80" w:type="dxa"/>
+              <w:start w:w="80" w:type="dxa"/>
+              <w:bottom w:w="80" w:type="dxa"/>
+              <w:end w:w="80" w:type="dxa"/>
+            </w:tcMar>
+            <w:tcBorders>
+              <w:top w:val="single" w:sz="6" w:space="0" w:color="7F7F7F"/>
+              <w:left w:val="single" w:sz="6" w:space="0" w:color="7F7F7F"/>
+              <w:bottom w:val="single" w:sz="6" w:space="0" w:color="7F7F7F"/>
+              <w:right w:val="single" w:sz="6" w:space="0" w:color="7F7F7F"/>
+              <w:insideH w:val="single" w:sz="6" w:space="0" w:color="7F7F7F"/>
+              <w:insideV w:val="single" w:sz="6" w:space="0" w:color="7F7F7F"/>
+            </w:tcBorders>
+            <w:shd w:fill="1F4E79"/>
+          </w:tcPr>
+          <w:p>
+            <w:pPr>
+              <w:spacing w:after="0"/>
+              <w:jc w:val="center"/>
+            </w:pPr>
+            <w:r>
+              <w:rPr>
+                <w:rFonts w:ascii="Times New Roman" w:hAnsi="Times New Roman" w:eastAsia="Times New Roman"/>
+                <w:b/>
+                <w:i w:val="0"/>
+                <w:color w:val="FFFFFF"/>
+                <w:sz w:val="16"/>
+              </w:rPr>
+            </w:r>
+            <w:r>
+              <w:rPr>
+                <w:rFonts w:ascii="Times New Roman" w:hAnsi="Times New Roman" w:eastAsia="Times New Roman"/>
+                <w:b/>
+                <w:i w:val="0"/>
+                <w:color w:val="FFFFFF"/>
+                <w:sz w:val="16"/>
+              </w:rPr>
+              <w:t>Nhánh Git</w:t>
+            </w:r>
+          </w:p>
+        </w:tc>
+      </w:tr>
+      <w:tr>
+        <w:tc>
+          <w:tcPr>
+            <w:tcW w:type="dxa" w:w="2154"/>
+            <w:vAlign w:val="center"/>
+            <w:tcMar>
+              <w:top w:w="80" w:type="dxa"/>
+              <w:start w:w="80" w:type="dxa"/>
+              <w:bottom w:w="80" w:type="dxa"/>
+              <w:end w:w="80" w:type="dxa"/>
+            </w:tcMar>
+            <w:tcBorders>
+              <w:top w:val="single" w:sz="6" w:space="0" w:color="7F7F7F"/>
+              <w:left w:val="single" w:sz="6" w:space="0" w:color="7F7F7F"/>
+              <w:bottom w:val="single" w:sz="6" w:space="0" w:color="7F7F7F"/>
+              <w:right w:val="single" w:sz="6" w:space="0" w:color="7F7F7F"/>
+              <w:insideH w:val="single" w:sz="6" w:space="0" w:color="7F7F7F"/>
+              <w:insideV w:val="single" w:sz="6" w:space="0" w:color="7F7F7F"/>
+            </w:tcBorders>
+          </w:tcPr>
+          <w:p>
+            <w:pPr>
+              <w:spacing w:after="0"/>
+              <w:jc w:val="left"/>
+            </w:pPr>
+            <w:r>
+              <w:rPr>
+                <w:rFonts w:ascii="Times New Roman" w:hAnsi="Times New Roman" w:eastAsia="Times New Roman"/>
+                <w:b w:val="0"/>
+                <w:i w:val="0"/>
+                <w:sz w:val="16"/>
+              </w:rPr>
+            </w:r>
+            <w:r>
+              <w:rPr>
+                <w:rFonts w:ascii="Times New Roman" w:hAnsi="Times New Roman" w:eastAsia="Times New Roman"/>
+                <w:b w:val="0"/>
+                <w:i w:val="0"/>
+                <w:sz w:val="16"/>
+              </w:rPr>
+              <w:t>Khởi tạo repository và solution</w:t>
+            </w:r>
+          </w:p>
+        </w:tc>
+        <w:tc>
+          <w:tcPr>
+            <w:tcW w:type="dxa" w:w="1304"/>
+            <w:vAlign w:val="center"/>
+            <w:tcMar>
+              <w:top w:w="80" w:type="dxa"/>
+              <w:start w:w="80" w:type="dxa"/>
+              <w:bottom w:w="80" w:type="dxa"/>
+              <w:end w:w="80" w:type="dxa"/>
+            </w:tcMar>
+            <w:tcBorders>
+              <w:top w:val="single" w:sz="6" w:space="0" w:color="7F7F7F"/>
+              <w:left w:val="single" w:sz="6" w:space="0" w:color="7F7F7F"/>
+              <w:bottom w:val="single" w:sz="6" w:space="0" w:color="7F7F7F"/>
+              <w:right w:val="single" w:sz="6" w:space="0" w:color="7F7F7F"/>
+              <w:insideH w:val="single" w:sz="6" w:space="0" w:color="7F7F7F"/>
+              <w:insideV w:val="single" w:sz="6" w:space="0" w:color="7F7F7F"/>
+            </w:tcBorders>
+          </w:tcPr>
+          <w:p>
+            <w:pPr>
+              <w:spacing w:after="0"/>
+              <w:jc w:val="left"/>
+            </w:pPr>
+            <w:r>
+              <w:rPr>
+                <w:rFonts w:ascii="Times New Roman" w:hAnsi="Times New Roman" w:eastAsia="Times New Roman"/>
+                <w:b w:val="0"/>
+                <w:i w:val="0"/>
+                <w:sz w:val="16"/>
+              </w:rPr>
+            </w:r>
+            <w:r>
+              <w:rPr>
+                <w:rFonts w:ascii="Times New Roman" w:hAnsi="Times New Roman" w:eastAsia="Times New Roman"/>
+                <w:b w:val="0"/>
+                <w:i w:val="0"/>
+                <w:sz w:val="16"/>
+              </w:rPr>
+              <w:t>Nguyễn Tấn Hiệp</w:t>
+            </w:r>
+          </w:p>
+        </w:tc>
+        <w:tc>
+          <w:tcPr>
+            <w:tcW w:type="dxa" w:w="680"/>
+            <w:vAlign w:val="center"/>
+            <w:tcMar>
+              <w:top w:w="80" w:type="dxa"/>
+              <w:start w:w="80" w:type="dxa"/>
+              <w:bottom w:w="80" w:type="dxa"/>
+              <w:end w:w="80" w:type="dxa"/>
+            </w:tcMar>
+            <w:tcBorders>
+              <w:top w:val="single" w:sz="6" w:space="0" w:color="7F7F7F"/>
+              <w:left w:val="single" w:sz="6" w:space="0" w:color="7F7F7F"/>
+              <w:bottom w:val="single" w:sz="6" w:space="0" w:color="7F7F7F"/>
+              <w:right w:val="single" w:sz="6" w:space="0" w:color="7F7F7F"/>
+              <w:insideH w:val="single" w:sz="6" w:space="0" w:color="7F7F7F"/>
+              <w:insideV w:val="single" w:sz="6" w:space="0" w:color="7F7F7F"/>
+            </w:tcBorders>
+          </w:tcPr>
+          <w:p>
+            <w:pPr>
+              <w:spacing w:after="0"/>
+              <w:jc w:val="left"/>
+            </w:pPr>
+            <w:r>
+              <w:rPr>
+                <w:rFonts w:ascii="Times New Roman" w:hAnsi="Times New Roman" w:eastAsia="Times New Roman"/>
+                <w:b w:val="0"/>
+                <w:i w:val="0"/>
+                <w:sz w:val="16"/>
+              </w:rPr>
+            </w:r>
+            <w:r>
+              <w:rPr>
+                <w:rFonts w:ascii="Times New Roman" w:hAnsi="Times New Roman" w:eastAsia="Times New Roman"/>
+                <w:b w:val="0"/>
+                <w:i w:val="0"/>
+                <w:sz w:val="16"/>
+              </w:rPr>
+              <w:t>P0</w:t>
+            </w:r>
+          </w:p>
+        </w:tc>
+        <w:tc>
+          <w:tcPr>
+            <w:tcW w:type="dxa" w:w="1190"/>
+            <w:vAlign w:val="center"/>
+            <w:tcMar>
+              <w:top w:w="80" w:type="dxa"/>
+              <w:start w:w="80" w:type="dxa"/>
+              <w:bottom w:w="80" w:type="dxa"/>
+              <w:end w:w="80" w:type="dxa"/>
+            </w:tcMar>
+            <w:tcBorders>
+              <w:top w:val="single" w:sz="6" w:space="0" w:color="7F7F7F"/>
+              <w:left w:val="single" w:sz="6" w:space="0" w:color="7F7F7F"/>
+              <w:bottom w:val="single" w:sz="6" w:space="0" w:color="7F7F7F"/>
+              <w:right w:val="single" w:sz="6" w:space="0" w:color="7F7F7F"/>
+              <w:insideH w:val="single" w:sz="6" w:space="0" w:color="7F7F7F"/>
+              <w:insideV w:val="single" w:sz="6" w:space="0" w:color="7F7F7F"/>
+            </w:tcBorders>
+          </w:tcPr>
+          <w:p>
+            <w:pPr>
+              <w:spacing w:after="0"/>
+              <w:jc w:val="left"/>
+            </w:pPr>
+            <w:r>
+              <w:rPr>
+                <w:rFonts w:ascii="Times New Roman" w:hAnsi="Times New Roman" w:eastAsia="Times New Roman"/>
+                <w:b w:val="0"/>
+                <w:i w:val="0"/>
+                <w:sz w:val="16"/>
+              </w:rPr>
+            </w:r>
+            <w:r>
+              <w:rPr>
+                <w:rFonts w:ascii="Times New Roman" w:hAnsi="Times New Roman" w:eastAsia="Times New Roman"/>
+                <w:b w:val="0"/>
+                <w:i w:val="0"/>
+                <w:sz w:val="16"/>
+              </w:rPr>
+              <w:t>Đã hoàn thành</w:t>
+            </w:r>
+          </w:p>
+        </w:tc>
+        <w:tc>
+          <w:tcPr>
+            <w:tcW w:type="dxa" w:w="1474"/>
+            <w:vAlign w:val="center"/>
+            <w:tcMar>
+              <w:top w:w="80" w:type="dxa"/>
+              <w:start w:w="80" w:type="dxa"/>
+              <w:bottom w:w="80" w:type="dxa"/>
+              <w:end w:w="80" w:type="dxa"/>
+            </w:tcMar>
+            <w:tcBorders>
+              <w:top w:val="single" w:sz="6" w:space="0" w:color="7F7F7F"/>
+              <w:left w:val="single" w:sz="6" w:space="0" w:color="7F7F7F"/>
+              <w:bottom w:val="single" w:sz="6" w:space="0" w:color="7F7F7F"/>
+              <w:right w:val="single" w:sz="6" w:space="0" w:color="7F7F7F"/>
+              <w:insideH w:val="single" w:sz="6" w:space="0" w:color="7F7F7F"/>
+              <w:insideV w:val="single" w:sz="6" w:space="0" w:color="7F7F7F"/>
+            </w:tcBorders>
+          </w:tcPr>
+          <w:p>
+            <w:pPr>
+              <w:spacing w:after="0"/>
+              <w:jc w:val="left"/>
+            </w:pPr>
+            <w:r>
+              <w:rPr>
+                <w:rFonts w:ascii="Times New Roman" w:hAnsi="Times New Roman" w:eastAsia="Times New Roman"/>
+                <w:b w:val="0"/>
+                <w:i w:val="0"/>
+                <w:sz w:val="16"/>
+              </w:rPr>
+            </w:r>
+            <w:r>
+              <w:rPr>
+                <w:rFonts w:ascii="Times New Roman" w:hAnsi="Times New Roman" w:eastAsia="Times New Roman"/>
+                <w:b w:val="0"/>
+                <w:i w:val="0"/>
+                <w:sz w:val="16"/>
+              </w:rPr>
+              <w:t>01/08/2026 - 02/08/2026</w:t>
+            </w:r>
+          </w:p>
+        </w:tc>
+        <w:tc>
+          <w:tcPr>
+            <w:tcW w:type="dxa" w:w="3061"/>
+            <w:vAlign w:val="center"/>
+            <w:tcMar>
+              <w:top w:w="80" w:type="dxa"/>
+              <w:start w:w="80" w:type="dxa"/>
+              <w:bottom w:w="80" w:type="dxa"/>
+              <w:end w:w="80" w:type="dxa"/>
+            </w:tcMar>
+            <w:tcBorders>
+              <w:top w:val="single" w:sz="6" w:space="0" w:color="7F7F7F"/>
+              <w:left w:val="single" w:sz="6" w:space="0" w:color="7F7F7F"/>
+              <w:bottom w:val="single" w:sz="6" w:space="0" w:color="7F7F7F"/>
+              <w:right w:val="single" w:sz="6" w:space="0" w:color="7F7F7F"/>
+              <w:insideH w:val="single" w:sz="6" w:space="0" w:color="7F7F7F"/>
+              <w:insideV w:val="single" w:sz="6" w:space="0" w:color="7F7F7F"/>
+            </w:tcBorders>
+          </w:tcPr>
+          <w:p>
+            <w:pPr>
+              <w:spacing w:after="0"/>
+              <w:jc w:val="left"/>
+            </w:pPr>
+            <w:r>
+              <w:rPr>
+                <w:rFonts w:ascii="Times New Roman" w:hAnsi="Times New Roman" w:eastAsia="Times New Roman"/>
+                <w:b w:val="0"/>
+                <w:i w:val="0"/>
+                <w:sz w:val="16"/>
+              </w:rPr>
+            </w:r>
+            <w:r>
+              <w:rPr>
+                <w:rFonts w:ascii="Times New Roman" w:hAnsi="Times New Roman" w:eastAsia="Times New Roman"/>
+                <w:b w:val="0"/>
+                <w:i w:val="0"/>
+                <w:sz w:val="16"/>
+              </w:rPr>
+              <w:t>README.md, .gitignore, .sln, .csproj, appsettings.json</w:t>
+            </w:r>
+          </w:p>
+        </w:tc>
+        <w:tc>
+          <w:tcPr>
+            <w:tcW w:type="dxa" w:w="2664"/>
+            <w:vAlign w:val="center"/>
+            <w:tcMar>
+              <w:top w:w="80" w:type="dxa"/>
+              <w:start w:w="80" w:type="dxa"/>
+              <w:bottom w:w="80" w:type="dxa"/>
+              <w:end w:w="80" w:type="dxa"/>
+            </w:tcMar>
+            <w:tcBorders>
+              <w:top w:val="single" w:sz="6" w:space="0" w:color="7F7F7F"/>
+              <w:left w:val="single" w:sz="6" w:space="0" w:color="7F7F7F"/>
+              <w:bottom w:val="single" w:sz="6" w:space="0" w:color="7F7F7F"/>
+              <w:right w:val="single" w:sz="6" w:space="0" w:color="7F7F7F"/>
+              <w:insideH w:val="single" w:sz="6" w:space="0" w:color="7F7F7F"/>
+              <w:insideV w:val="single" w:sz="6" w:space="0" w:color="7F7F7F"/>
+            </w:tcBorders>
+          </w:tcPr>
+          <w:p>
+            <w:pPr>
+              <w:spacing w:after="0"/>
+              <w:jc w:val="left"/>
+            </w:pPr>
+            <w:r>
+              <w:rPr>
+                <w:rFonts w:ascii="Times New Roman" w:hAnsi="Times New Roman" w:eastAsia="Times New Roman"/>
+                <w:b w:val="0"/>
+                <w:i w:val="0"/>
+                <w:sz w:val="16"/>
+              </w:rPr>
+            </w:r>
+            <w:r>
+              <w:rPr>
+                <w:rFonts w:ascii="Times New Roman" w:hAnsi="Times New Roman" w:eastAsia="Times New Roman"/>
+                <w:b w:val="0"/>
+                <w:i w:val="0"/>
+                <w:sz w:val="16"/>
+              </w:rPr>
+              <w:t>chore/setup-project-structure</w:t>
+            </w:r>
+          </w:p>
+        </w:tc>
+      </w:tr>
+      <w:tr>
+        <w:tc>
+          <w:tcPr>
+            <w:tcW w:type="dxa" w:w="2154"/>
+            <w:vAlign w:val="center"/>
+            <w:tcMar>
+              <w:top w:w="80" w:type="dxa"/>
+              <w:start w:w="80" w:type="dxa"/>
+              <w:bottom w:w="80" w:type="dxa"/>
+              <w:end w:w="80" w:type="dxa"/>
+            </w:tcMar>
+            <w:tcBorders>
+              <w:top w:val="single" w:sz="6" w:space="0" w:color="7F7F7F"/>
+              <w:left w:val="single" w:sz="6" w:space="0" w:color="7F7F7F"/>
+              <w:bottom w:val="single" w:sz="6" w:space="0" w:color="7F7F7F"/>
+              <w:right w:val="single" w:sz="6" w:space="0" w:color="7F7F7F"/>
+              <w:insideH w:val="single" w:sz="6" w:space="0" w:color="7F7F7F"/>
+              <w:insideV w:val="single" w:sz="6" w:space="0" w:color="7F7F7F"/>
+            </w:tcBorders>
+          </w:tcPr>
+          <w:p>
+            <w:pPr>
+              <w:spacing w:after="0"/>
+              <w:jc w:val="left"/>
+            </w:pPr>
+            <w:r>
+              <w:rPr>
+                <w:rFonts w:ascii="Times New Roman" w:hAnsi="Times New Roman" w:eastAsia="Times New Roman"/>
+                <w:b w:val="0"/>
+                <w:i w:val="0"/>
+                <w:sz w:val="16"/>
+              </w:rPr>
+            </w:r>
+            <w:r>
+              <w:rPr>
+                <w:rFonts w:ascii="Times New Roman" w:hAnsi="Times New Roman" w:eastAsia="Times New Roman"/>
+                <w:b w:val="0"/>
+                <w:i w:val="0"/>
+                <w:sz w:val="16"/>
+              </w:rPr>
+              <w:t>Shared protocol phiên bản 1</w:t>
+            </w:r>
+          </w:p>
+        </w:tc>
+        <w:tc>
+          <w:tcPr>
+            <w:tcW w:type="dxa" w:w="1304"/>
+            <w:vAlign w:val="center"/>
+            <w:tcMar>
+              <w:top w:w="80" w:type="dxa"/>
+              <w:start w:w="80" w:type="dxa"/>
+              <w:bottom w:w="80" w:type="dxa"/>
+              <w:end w:w="80" w:type="dxa"/>
+            </w:tcMar>
+            <w:tcBorders>
+              <w:top w:val="single" w:sz="6" w:space="0" w:color="7F7F7F"/>
+              <w:left w:val="single" w:sz="6" w:space="0" w:color="7F7F7F"/>
+              <w:bottom w:val="single" w:sz="6" w:space="0" w:color="7F7F7F"/>
+              <w:right w:val="single" w:sz="6" w:space="0" w:color="7F7F7F"/>
+              <w:insideH w:val="single" w:sz="6" w:space="0" w:color="7F7F7F"/>
+              <w:insideV w:val="single" w:sz="6" w:space="0" w:color="7F7F7F"/>
+            </w:tcBorders>
+          </w:tcPr>
+          <w:p>
+            <w:pPr>
+              <w:spacing w:after="0"/>
+              <w:jc w:val="left"/>
+            </w:pPr>
+            <w:r>
+              <w:rPr>
+                <w:rFonts w:ascii="Times New Roman" w:hAnsi="Times New Roman" w:eastAsia="Times New Roman"/>
+                <w:b w:val="0"/>
+                <w:i w:val="0"/>
+                <w:sz w:val="16"/>
+              </w:rPr>
+            </w:r>
+            <w:r>
+              <w:rPr>
+                <w:rFonts w:ascii="Times New Roman" w:hAnsi="Times New Roman" w:eastAsia="Times New Roman"/>
+                <w:b w:val="0"/>
+                <w:i w:val="0"/>
+                <w:sz w:val="16"/>
+              </w:rPr>
+              <w:t>Phạm Anh Tuấn</w:t>
+            </w:r>
+          </w:p>
+        </w:tc>
+        <w:tc>
+          <w:tcPr>
+            <w:tcW w:type="dxa" w:w="680"/>
+            <w:vAlign w:val="center"/>
+            <w:tcMar>
+              <w:top w:w="80" w:type="dxa"/>
+              <w:start w:w="80" w:type="dxa"/>
+              <w:bottom w:w="80" w:type="dxa"/>
+              <w:end w:w="80" w:type="dxa"/>
+            </w:tcMar>
+            <w:tcBorders>
+              <w:top w:val="single" w:sz="6" w:space="0" w:color="7F7F7F"/>
+              <w:left w:val="single" w:sz="6" w:space="0" w:color="7F7F7F"/>
+              <w:bottom w:val="single" w:sz="6" w:space="0" w:color="7F7F7F"/>
+              <w:right w:val="single" w:sz="6" w:space="0" w:color="7F7F7F"/>
+              <w:insideH w:val="single" w:sz="6" w:space="0" w:color="7F7F7F"/>
+              <w:insideV w:val="single" w:sz="6" w:space="0" w:color="7F7F7F"/>
+            </w:tcBorders>
+          </w:tcPr>
+          <w:p>
+            <w:pPr>
+              <w:spacing w:after="0"/>
+              <w:jc w:val="left"/>
+            </w:pPr>
+            <w:r>
+              <w:rPr>
+                <w:rFonts w:ascii="Times New Roman" w:hAnsi="Times New Roman" w:eastAsia="Times New Roman"/>
+                <w:b w:val="0"/>
+                <w:i w:val="0"/>
+                <w:sz w:val="16"/>
+              </w:rPr>
+            </w:r>
+            <w:r>
+              <w:rPr>
+                <w:rFonts w:ascii="Times New Roman" w:hAnsi="Times New Roman" w:eastAsia="Times New Roman"/>
+                <w:b w:val="0"/>
+                <w:i w:val="0"/>
+                <w:sz w:val="16"/>
+              </w:rPr>
+              <w:t>P0</w:t>
+            </w:r>
+          </w:p>
+        </w:tc>
+        <w:tc>
+          <w:tcPr>
+            <w:tcW w:type="dxa" w:w="1190"/>
+            <w:vAlign w:val="center"/>
+            <w:tcMar>
+              <w:top w:w="80" w:type="dxa"/>
+              <w:start w:w="80" w:type="dxa"/>
+              <w:bottom w:w="80" w:type="dxa"/>
+              <w:end w:w="80" w:type="dxa"/>
+            </w:tcMar>
+            <w:tcBorders>
+              <w:top w:val="single" w:sz="6" w:space="0" w:color="7F7F7F"/>
+              <w:left w:val="single" w:sz="6" w:space="0" w:color="7F7F7F"/>
+              <w:bottom w:val="single" w:sz="6" w:space="0" w:color="7F7F7F"/>
+              <w:right w:val="single" w:sz="6" w:space="0" w:color="7F7F7F"/>
+              <w:insideH w:val="single" w:sz="6" w:space="0" w:color="7F7F7F"/>
+              <w:insideV w:val="single" w:sz="6" w:space="0" w:color="7F7F7F"/>
+            </w:tcBorders>
+          </w:tcPr>
+          <w:p>
+            <w:pPr>
+              <w:spacing w:after="0"/>
+              <w:jc w:val="left"/>
+            </w:pPr>
+            <w:r>
+              <w:rPr>
+                <w:rFonts w:ascii="Times New Roman" w:hAnsi="Times New Roman" w:eastAsia="Times New Roman"/>
+                <w:b w:val="0"/>
+                <w:i w:val="0"/>
+                <w:sz w:val="16"/>
+              </w:rPr>
+            </w:r>
+            <w:r>
+              <w:rPr>
+                <w:rFonts w:ascii="Times New Roman" w:hAnsi="Times New Roman" w:eastAsia="Times New Roman"/>
+                <w:b w:val="0"/>
+                <w:i w:val="0"/>
+                <w:sz w:val="16"/>
+              </w:rPr>
+              <w:t>Đã hoàn thành</w:t>
+            </w:r>
+          </w:p>
+        </w:tc>
+        <w:tc>
+          <w:tcPr>
+            <w:tcW w:type="dxa" w:w="1474"/>
+            <w:vAlign w:val="center"/>
+            <w:tcMar>
+              <w:top w:w="80" w:type="dxa"/>
+              <w:start w:w="80" w:type="dxa"/>
+              <w:bottom w:w="80" w:type="dxa"/>
+              <w:end w:w="80" w:type="dxa"/>
+            </w:tcMar>
+            <w:tcBorders>
+              <w:top w:val="single" w:sz="6" w:space="0" w:color="7F7F7F"/>
+              <w:left w:val="single" w:sz="6" w:space="0" w:color="7F7F7F"/>
+              <w:bottom w:val="single" w:sz="6" w:space="0" w:color="7F7F7F"/>
+              <w:right w:val="single" w:sz="6" w:space="0" w:color="7F7F7F"/>
+              <w:insideH w:val="single" w:sz="6" w:space="0" w:color="7F7F7F"/>
+              <w:insideV w:val="single" w:sz="6" w:space="0" w:color="7F7F7F"/>
+            </w:tcBorders>
+          </w:tcPr>
+          <w:p>
+            <w:pPr>
+              <w:spacing w:after="0"/>
+              <w:jc w:val="left"/>
+            </w:pPr>
+            <w:r>
+              <w:rPr>
+                <w:rFonts w:ascii="Times New Roman" w:hAnsi="Times New Roman" w:eastAsia="Times New Roman"/>
+                <w:b w:val="0"/>
+                <w:i w:val="0"/>
+                <w:sz w:val="16"/>
+              </w:rPr>
+            </w:r>
+            <w:r>
+              <w:rPr>
+                <w:rFonts w:ascii="Times New Roman" w:hAnsi="Times New Roman" w:eastAsia="Times New Roman"/>
+                <w:b w:val="0"/>
+                <w:i w:val="0"/>
+                <w:sz w:val="16"/>
+              </w:rPr>
+              <w:t>02/08/2026 - 03/08/2026</w:t>
+            </w:r>
+          </w:p>
+        </w:tc>
+        <w:tc>
+          <w:tcPr>
+            <w:tcW w:type="dxa" w:w="3061"/>
+            <w:vAlign w:val="center"/>
+            <w:tcMar>
+              <w:top w:w="80" w:type="dxa"/>
+              <w:start w:w="80" w:type="dxa"/>
+              <w:bottom w:w="80" w:type="dxa"/>
+              <w:end w:w="80" w:type="dxa"/>
+            </w:tcMar>
+            <w:tcBorders>
+              <w:top w:val="single" w:sz="6" w:space="0" w:color="7F7F7F"/>
+              <w:left w:val="single" w:sz="6" w:space="0" w:color="7F7F7F"/>
+              <w:bottom w:val="single" w:sz="6" w:space="0" w:color="7F7F7F"/>
+              <w:right w:val="single" w:sz="6" w:space="0" w:color="7F7F7F"/>
+              <w:insideH w:val="single" w:sz="6" w:space="0" w:color="7F7F7F"/>
+              <w:insideV w:val="single" w:sz="6" w:space="0" w:color="7F7F7F"/>
+            </w:tcBorders>
+          </w:tcPr>
+          <w:p>
+            <w:pPr>
+              <w:spacing w:after="0"/>
+              <w:jc w:val="left"/>
+            </w:pPr>
+            <w:r>
+              <w:rPr>
+                <w:rFonts w:ascii="Times New Roman" w:hAnsi="Times New Roman" w:eastAsia="Times New Roman"/>
+                <w:b w:val="0"/>
+                <w:i w:val="0"/>
+                <w:sz w:val="16"/>
+              </w:rPr>
+            </w:r>
+            <w:r>
+              <w:rPr>
+                <w:rFonts w:ascii="Times New Roman" w:hAnsi="Times New Roman" w:eastAsia="Times New Roman"/>
+                <w:b w:val="0"/>
+                <w:i w:val="0"/>
+                <w:sz w:val="16"/>
+              </w:rPr>
+              <w:t>UploadRequest.cs, UploadResponse.cs, UploadStatus.cs, ErrorCode.cs, ProtocolReader.cs, ProtocolWriter.cs</w:t>
+            </w:r>
+          </w:p>
+        </w:tc>
+        <w:tc>
+          <w:tcPr>
+            <w:tcW w:type="dxa" w:w="2664"/>
+            <w:vAlign w:val="center"/>
+            <w:tcMar>
+              <w:top w:w="80" w:type="dxa"/>
+              <w:start w:w="80" w:type="dxa"/>
+              <w:bottom w:w="80" w:type="dxa"/>
+              <w:end w:w="80" w:type="dxa"/>
+            </w:tcMar>
+            <w:tcBorders>
+              <w:top w:val="single" w:sz="6" w:space="0" w:color="7F7F7F"/>
+              <w:left w:val="single" w:sz="6" w:space="0" w:color="7F7F7F"/>
+              <w:bottom w:val="single" w:sz="6" w:space="0" w:color="7F7F7F"/>
+              <w:right w:val="single" w:sz="6" w:space="0" w:color="7F7F7F"/>
+              <w:insideH w:val="single" w:sz="6" w:space="0" w:color="7F7F7F"/>
+              <w:insideV w:val="single" w:sz="6" w:space="0" w:color="7F7F7F"/>
+            </w:tcBorders>
+          </w:tcPr>
+          <w:p>
+            <w:pPr>
+              <w:spacing w:after="0"/>
+              <w:jc w:val="left"/>
+            </w:pPr>
+            <w:r>
+              <w:rPr>
+                <w:rFonts w:ascii="Times New Roman" w:hAnsi="Times New Roman" w:eastAsia="Times New Roman"/>
+                <w:b w:val="0"/>
+                <w:i w:val="0"/>
+                <w:sz w:val="16"/>
+              </w:rPr>
+            </w:r>
+            <w:r>
+              <w:rPr>
+                <w:rFonts w:ascii="Times New Roman" w:hAnsi="Times New Roman" w:eastAsia="Times New Roman"/>
+                <w:b w:val="0"/>
+                <w:i w:val="0"/>
+                <w:sz w:val="16"/>
+              </w:rPr>
+              <w:t>feature/shared-protocol-v1</w:t>
+            </w:r>
+          </w:p>
+        </w:tc>
+      </w:tr>
+      <w:tr>
+        <w:tc>
+          <w:tcPr>
+            <w:tcW w:type="dxa" w:w="2154"/>
+            <w:vAlign w:val="center"/>
+            <w:tcMar>
+              <w:top w:w="80" w:type="dxa"/>
+              <w:start w:w="80" w:type="dxa"/>
+              <w:bottom w:w="80" w:type="dxa"/>
+              <w:end w:w="80" w:type="dxa"/>
+            </w:tcMar>
+            <w:tcBorders>
+              <w:top w:val="single" w:sz="6" w:space="0" w:color="7F7F7F"/>
+              <w:left w:val="single" w:sz="6" w:space="0" w:color="7F7F7F"/>
+              <w:bottom w:val="single" w:sz="6" w:space="0" w:color="7F7F7F"/>
+              <w:right w:val="single" w:sz="6" w:space="0" w:color="7F7F7F"/>
+              <w:insideH w:val="single" w:sz="6" w:space="0" w:color="7F7F7F"/>
+              <w:insideV w:val="single" w:sz="6" w:space="0" w:color="7F7F7F"/>
+            </w:tcBorders>
+          </w:tcPr>
+          <w:p>
+            <w:pPr>
+              <w:spacing w:after="0"/>
+              <w:jc w:val="left"/>
+            </w:pPr>
+            <w:r>
+              <w:rPr>
+                <w:rFonts w:ascii="Times New Roman" w:hAnsi="Times New Roman" w:eastAsia="Times New Roman"/>
+                <w:b w:val="0"/>
+                <w:i w:val="0"/>
+                <w:sz w:val="16"/>
+              </w:rPr>
+            </w:r>
+            <w:r>
+              <w:rPr>
+                <w:rFonts w:ascii="Times New Roman" w:hAnsi="Times New Roman" w:eastAsia="Times New Roman"/>
+                <w:b w:val="0"/>
+                <w:i w:val="0"/>
+                <w:sz w:val="16"/>
+              </w:rPr>
+              <w:t>Client WPF cơ bản và chọn file</w:t>
+            </w:r>
+          </w:p>
+        </w:tc>
+        <w:tc>
+          <w:tcPr>
+            <w:tcW w:type="dxa" w:w="1304"/>
+            <w:vAlign w:val="center"/>
+            <w:tcMar>
+              <w:top w:w="80" w:type="dxa"/>
+              <w:start w:w="80" w:type="dxa"/>
+              <w:bottom w:w="80" w:type="dxa"/>
+              <w:end w:w="80" w:type="dxa"/>
+            </w:tcMar>
+            <w:tcBorders>
+              <w:top w:val="single" w:sz="6" w:space="0" w:color="7F7F7F"/>
+              <w:left w:val="single" w:sz="6" w:space="0" w:color="7F7F7F"/>
+              <w:bottom w:val="single" w:sz="6" w:space="0" w:color="7F7F7F"/>
+              <w:right w:val="single" w:sz="6" w:space="0" w:color="7F7F7F"/>
+              <w:insideH w:val="single" w:sz="6" w:space="0" w:color="7F7F7F"/>
+              <w:insideV w:val="single" w:sz="6" w:space="0" w:color="7F7F7F"/>
+            </w:tcBorders>
+          </w:tcPr>
+          <w:p>
+            <w:pPr>
+              <w:spacing w:after="0"/>
+              <w:jc w:val="left"/>
+            </w:pPr>
+            <w:r>
+              <w:rPr>
+                <w:rFonts w:ascii="Times New Roman" w:hAnsi="Times New Roman" w:eastAsia="Times New Roman"/>
+                <w:b w:val="0"/>
+                <w:i w:val="0"/>
+                <w:sz w:val="16"/>
+              </w:rPr>
+            </w:r>
+            <w:r>
+              <w:rPr>
+                <w:rFonts w:ascii="Times New Roman" w:hAnsi="Times New Roman" w:eastAsia="Times New Roman"/>
+                <w:b w:val="0"/>
+                <w:i w:val="0"/>
+                <w:sz w:val="16"/>
+              </w:rPr>
+              <w:t>Lê Văn Nhựt</w:t>
+            </w:r>
+          </w:p>
+        </w:tc>
+        <w:tc>
+          <w:tcPr>
+            <w:tcW w:type="dxa" w:w="680"/>
+            <w:vAlign w:val="center"/>
+            <w:tcMar>
+              <w:top w:w="80" w:type="dxa"/>
+              <w:start w:w="80" w:type="dxa"/>
+              <w:bottom w:w="80" w:type="dxa"/>
+              <w:end w:w="80" w:type="dxa"/>
+            </w:tcMar>
+            <w:tcBorders>
+              <w:top w:val="single" w:sz="6" w:space="0" w:color="7F7F7F"/>
+              <w:left w:val="single" w:sz="6" w:space="0" w:color="7F7F7F"/>
+              <w:bottom w:val="single" w:sz="6" w:space="0" w:color="7F7F7F"/>
+              <w:right w:val="single" w:sz="6" w:space="0" w:color="7F7F7F"/>
+              <w:insideH w:val="single" w:sz="6" w:space="0" w:color="7F7F7F"/>
+              <w:insideV w:val="single" w:sz="6" w:space="0" w:color="7F7F7F"/>
+            </w:tcBorders>
+          </w:tcPr>
+          <w:p>
+            <w:pPr>
+              <w:spacing w:after="0"/>
+              <w:jc w:val="left"/>
+            </w:pPr>
+            <w:r>
+              <w:rPr>
+                <w:rFonts w:ascii="Times New Roman" w:hAnsi="Times New Roman" w:eastAsia="Times New Roman"/>
+                <w:b w:val="0"/>
+                <w:i w:val="0"/>
+                <w:sz w:val="16"/>
+              </w:rPr>
+            </w:r>
+            <w:r>
+              <w:rPr>
+                <w:rFonts w:ascii="Times New Roman" w:hAnsi="Times New Roman" w:eastAsia="Times New Roman"/>
+                <w:b w:val="0"/>
+                <w:i w:val="0"/>
+                <w:sz w:val="16"/>
+              </w:rPr>
+              <w:t>P1</w:t>
+            </w:r>
+          </w:p>
+        </w:tc>
+        <w:tc>
+          <w:tcPr>
+            <w:tcW w:type="dxa" w:w="1190"/>
+            <w:vAlign w:val="center"/>
+            <w:tcMar>
+              <w:top w:w="80" w:type="dxa"/>
+              <w:start w:w="80" w:type="dxa"/>
+              <w:bottom w:w="80" w:type="dxa"/>
+              <w:end w:w="80" w:type="dxa"/>
+            </w:tcMar>
+            <w:tcBorders>
+              <w:top w:val="single" w:sz="6" w:space="0" w:color="7F7F7F"/>
+              <w:left w:val="single" w:sz="6" w:space="0" w:color="7F7F7F"/>
+              <w:bottom w:val="single" w:sz="6" w:space="0" w:color="7F7F7F"/>
+              <w:right w:val="single" w:sz="6" w:space="0" w:color="7F7F7F"/>
+              <w:insideH w:val="single" w:sz="6" w:space="0" w:color="7F7F7F"/>
+              <w:insideV w:val="single" w:sz="6" w:space="0" w:color="7F7F7F"/>
+            </w:tcBorders>
+          </w:tcPr>
+          <w:p>
+            <w:pPr>
+              <w:spacing w:after="0"/>
+              <w:jc w:val="left"/>
+            </w:pPr>
+            <w:r>
+              <w:rPr>
+                <w:rFonts w:ascii="Times New Roman" w:hAnsi="Times New Roman" w:eastAsia="Times New Roman"/>
+                <w:b w:val="0"/>
+                <w:i w:val="0"/>
+                <w:sz w:val="16"/>
+              </w:rPr>
+            </w:r>
+            <w:r>
+              <w:rPr>
+                <w:rFonts w:ascii="Times New Roman" w:hAnsi="Times New Roman" w:eastAsia="Times New Roman"/>
+                <w:b w:val="0"/>
+                <w:i w:val="0"/>
+                <w:sz w:val="16"/>
+              </w:rPr>
+              <w:t>Đã hoàn thành</w:t>
+            </w:r>
+          </w:p>
+        </w:tc>
+        <w:tc>
+          <w:tcPr>
+            <w:tcW w:type="dxa" w:w="1474"/>
+            <w:vAlign w:val="center"/>
+            <w:tcMar>
+              <w:top w:w="80" w:type="dxa"/>
+              <w:start w:w="80" w:type="dxa"/>
+              <w:bottom w:w="80" w:type="dxa"/>
+              <w:end w:w="80" w:type="dxa"/>
+            </w:tcMar>
+            <w:tcBorders>
+              <w:top w:val="single" w:sz="6" w:space="0" w:color="7F7F7F"/>
+              <w:left w:val="single" w:sz="6" w:space="0" w:color="7F7F7F"/>
+              <w:bottom w:val="single" w:sz="6" w:space="0" w:color="7F7F7F"/>
+              <w:right w:val="single" w:sz="6" w:space="0" w:color="7F7F7F"/>
+              <w:insideH w:val="single" w:sz="6" w:space="0" w:color="7F7F7F"/>
+              <w:insideV w:val="single" w:sz="6" w:space="0" w:color="7F7F7F"/>
+            </w:tcBorders>
+          </w:tcPr>
+          <w:p>
+            <w:pPr>
+              <w:spacing w:after="0"/>
+              <w:jc w:val="left"/>
+            </w:pPr>
+            <w:r>
+              <w:rPr>
+                <w:rFonts w:ascii="Times New Roman" w:hAnsi="Times New Roman" w:eastAsia="Times New Roman"/>
+                <w:b w:val="0"/>
+                <w:i w:val="0"/>
+                <w:sz w:val="16"/>
+              </w:rPr>
+            </w:r>
+            <w:r>
+              <w:rPr>
+                <w:rFonts w:ascii="Times New Roman" w:hAnsi="Times New Roman" w:eastAsia="Times New Roman"/>
+                <w:b w:val="0"/>
+                <w:i w:val="0"/>
+                <w:sz w:val="16"/>
+              </w:rPr>
+              <w:t>02/08/2026 - 05/08/2026</w:t>
+            </w:r>
+          </w:p>
+        </w:tc>
+        <w:tc>
+          <w:tcPr>
+            <w:tcW w:type="dxa" w:w="3061"/>
+            <w:vAlign w:val="center"/>
+            <w:tcMar>
+              <w:top w:w="80" w:type="dxa"/>
+              <w:start w:w="80" w:type="dxa"/>
+              <w:bottom w:w="80" w:type="dxa"/>
+              <w:end w:w="80" w:type="dxa"/>
+            </w:tcMar>
+            <w:tcBorders>
+              <w:top w:val="single" w:sz="6" w:space="0" w:color="7F7F7F"/>
+              <w:left w:val="single" w:sz="6" w:space="0" w:color="7F7F7F"/>
+              <w:bottom w:val="single" w:sz="6" w:space="0" w:color="7F7F7F"/>
+              <w:right w:val="single" w:sz="6" w:space="0" w:color="7F7F7F"/>
+              <w:insideH w:val="single" w:sz="6" w:space="0" w:color="7F7F7F"/>
+              <w:insideV w:val="single" w:sz="6" w:space="0" w:color="7F7F7F"/>
+            </w:tcBorders>
+          </w:tcPr>
+          <w:p>
+            <w:pPr>
+              <w:spacing w:after="0"/>
+              <w:jc w:val="left"/>
+            </w:pPr>
+            <w:r>
+              <w:rPr>
+                <w:rFonts w:ascii="Times New Roman" w:hAnsi="Times New Roman" w:eastAsia="Times New Roman"/>
+                <w:b w:val="0"/>
+                <w:i w:val="0"/>
+                <w:sz w:val="16"/>
+              </w:rPr>
+            </w:r>
+            <w:r>
+              <w:rPr>
+                <w:rFonts w:ascii="Times New Roman" w:hAnsi="Times New Roman" w:eastAsia="Times New Roman"/>
+                <w:b w:val="0"/>
+                <w:i w:val="0"/>
+                <w:sz w:val="16"/>
+              </w:rPr>
+              <w:t>MainWindow.xaml, MainWindow.xaml.cs, UploadItemViewModel.cs, App.xaml</w:t>
+            </w:r>
+          </w:p>
+        </w:tc>
+        <w:tc>
+          <w:tcPr>
+            <w:tcW w:type="dxa" w:w="2664"/>
+            <w:vAlign w:val="center"/>
+            <w:tcMar>
+              <w:top w:w="80" w:type="dxa"/>
+              <w:start w:w="80" w:type="dxa"/>
+              <w:bottom w:w="80" w:type="dxa"/>
+              <w:end w:w="80" w:type="dxa"/>
+            </w:tcMar>
+            <w:tcBorders>
+              <w:top w:val="single" w:sz="6" w:space="0" w:color="7F7F7F"/>
+              <w:left w:val="single" w:sz="6" w:space="0" w:color="7F7F7F"/>
+              <w:bottom w:val="single" w:sz="6" w:space="0" w:color="7F7F7F"/>
+              <w:right w:val="single" w:sz="6" w:space="0" w:color="7F7F7F"/>
+              <w:insideH w:val="single" w:sz="6" w:space="0" w:color="7F7F7F"/>
+              <w:insideV w:val="single" w:sz="6" w:space="0" w:color="7F7F7F"/>
+            </w:tcBorders>
+          </w:tcPr>
+          <w:p>
+            <w:pPr>
+              <w:spacing w:after="0"/>
+              <w:jc w:val="left"/>
+            </w:pPr>
+            <w:r>
+              <w:rPr>
+                <w:rFonts w:ascii="Times New Roman" w:hAnsi="Times New Roman" w:eastAsia="Times New Roman"/>
+                <w:b w:val="0"/>
+                <w:i w:val="0"/>
+                <w:sz w:val="16"/>
+              </w:rPr>
+            </w:r>
+            <w:r>
+              <w:rPr>
+                <w:rFonts w:ascii="Times New Roman" w:hAnsi="Times New Roman" w:eastAsia="Times New Roman"/>
+                <w:b w:val="0"/>
+                <w:i w:val="0"/>
+                <w:sz w:val="16"/>
+              </w:rPr>
+              <w:t>feature/client-wpf-shell</w:t>
+            </w:r>
+          </w:p>
+        </w:tc>
+      </w:tr>
+      <w:tr>
+        <w:tc>
+          <w:tcPr>
+            <w:tcW w:type="dxa" w:w="2154"/>
+            <w:vAlign w:val="center"/>
+            <w:tcMar>
+              <w:top w:w="80" w:type="dxa"/>
+              <w:start w:w="80" w:type="dxa"/>
+              <w:bottom w:w="80" w:type="dxa"/>
+              <w:end w:w="80" w:type="dxa"/>
+            </w:tcMar>
+            <w:tcBorders>
+              <w:top w:val="single" w:sz="6" w:space="0" w:color="7F7F7F"/>
+              <w:left w:val="single" w:sz="6" w:space="0" w:color="7F7F7F"/>
+              <w:bottom w:val="single" w:sz="6" w:space="0" w:color="7F7F7F"/>
+              <w:right w:val="single" w:sz="6" w:space="0" w:color="7F7F7F"/>
+              <w:insideH w:val="single" w:sz="6" w:space="0" w:color="7F7F7F"/>
+              <w:insideV w:val="single" w:sz="6" w:space="0" w:color="7F7F7F"/>
+            </w:tcBorders>
+          </w:tcPr>
+          <w:p>
+            <w:pPr>
+              <w:spacing w:after="0"/>
+              <w:jc w:val="left"/>
+            </w:pPr>
+            <w:r>
+              <w:rPr>
+                <w:rFonts w:ascii="Times New Roman" w:hAnsi="Times New Roman" w:eastAsia="Times New Roman"/>
+                <w:b w:val="0"/>
+                <w:i w:val="0"/>
+                <w:sz w:val="16"/>
+              </w:rPr>
+            </w:r>
+            <w:r>
+              <w:rPr>
+                <w:rFonts w:ascii="Times New Roman" w:hAnsi="Times New Roman" w:eastAsia="Times New Roman"/>
+                <w:b w:val="0"/>
+                <w:i w:val="0"/>
+                <w:sz w:val="16"/>
+              </w:rPr>
+              <w:t>Client gửi một file qua TCP</w:t>
+            </w:r>
+          </w:p>
+        </w:tc>
+        <w:tc>
+          <w:tcPr>
+            <w:tcW w:type="dxa" w:w="1304"/>
+            <w:vAlign w:val="center"/>
+            <w:tcMar>
+              <w:top w:w="80" w:type="dxa"/>
+              <w:start w:w="80" w:type="dxa"/>
+              <w:bottom w:w="80" w:type="dxa"/>
+              <w:end w:w="80" w:type="dxa"/>
+            </w:tcMar>
+            <w:tcBorders>
+              <w:top w:val="single" w:sz="6" w:space="0" w:color="7F7F7F"/>
+              <w:left w:val="single" w:sz="6" w:space="0" w:color="7F7F7F"/>
+              <w:bottom w:val="single" w:sz="6" w:space="0" w:color="7F7F7F"/>
+              <w:right w:val="single" w:sz="6" w:space="0" w:color="7F7F7F"/>
+              <w:insideH w:val="single" w:sz="6" w:space="0" w:color="7F7F7F"/>
+              <w:insideV w:val="single" w:sz="6" w:space="0" w:color="7F7F7F"/>
+            </w:tcBorders>
+          </w:tcPr>
+          <w:p>
+            <w:pPr>
+              <w:spacing w:after="0"/>
+              <w:jc w:val="left"/>
+            </w:pPr>
+            <w:r>
+              <w:rPr>
+                <w:rFonts w:ascii="Times New Roman" w:hAnsi="Times New Roman" w:eastAsia="Times New Roman"/>
+                <w:b w:val="0"/>
+                <w:i w:val="0"/>
+                <w:sz w:val="16"/>
+              </w:rPr>
+            </w:r>
+            <w:r>
+              <w:rPr>
+                <w:rFonts w:ascii="Times New Roman" w:hAnsi="Times New Roman" w:eastAsia="Times New Roman"/>
+                <w:b w:val="0"/>
+                <w:i w:val="0"/>
+                <w:sz w:val="16"/>
+              </w:rPr>
+              <w:t>Việt Tiến</w:t>
+            </w:r>
+          </w:p>
+        </w:tc>
+        <w:tc>
+          <w:tcPr>
+            <w:tcW w:type="dxa" w:w="680"/>
+            <w:vAlign w:val="center"/>
+            <w:tcMar>
+              <w:top w:w="80" w:type="dxa"/>
+              <w:start w:w="80" w:type="dxa"/>
+              <w:bottom w:w="80" w:type="dxa"/>
+              <w:end w:w="80" w:type="dxa"/>
+            </w:tcMar>
+            <w:tcBorders>
+              <w:top w:val="single" w:sz="6" w:space="0" w:color="7F7F7F"/>
+              <w:left w:val="single" w:sz="6" w:space="0" w:color="7F7F7F"/>
+              <w:bottom w:val="single" w:sz="6" w:space="0" w:color="7F7F7F"/>
+              <w:right w:val="single" w:sz="6" w:space="0" w:color="7F7F7F"/>
+              <w:insideH w:val="single" w:sz="6" w:space="0" w:color="7F7F7F"/>
+              <w:insideV w:val="single" w:sz="6" w:space="0" w:color="7F7F7F"/>
+            </w:tcBorders>
+          </w:tcPr>
+          <w:p>
+            <w:pPr>
+              <w:spacing w:after="0"/>
+              <w:jc w:val="left"/>
+            </w:pPr>
+            <w:r>
+              <w:rPr>
+                <w:rFonts w:ascii="Times New Roman" w:hAnsi="Times New Roman" w:eastAsia="Times New Roman"/>
+                <w:b w:val="0"/>
+                <w:i w:val="0"/>
+                <w:sz w:val="16"/>
+              </w:rPr>
+            </w:r>
+            <w:r>
+              <w:rPr>
+                <w:rFonts w:ascii="Times New Roman" w:hAnsi="Times New Roman" w:eastAsia="Times New Roman"/>
+                <w:b w:val="0"/>
+                <w:i w:val="0"/>
+                <w:sz w:val="16"/>
+              </w:rPr>
+              <w:t>P0</w:t>
+            </w:r>
+          </w:p>
+        </w:tc>
+        <w:tc>
+          <w:tcPr>
+            <w:tcW w:type="dxa" w:w="1190"/>
+            <w:vAlign w:val="center"/>
+            <w:tcMar>
+              <w:top w:w="80" w:type="dxa"/>
+              <w:start w:w="80" w:type="dxa"/>
+              <w:bottom w:w="80" w:type="dxa"/>
+              <w:end w:w="80" w:type="dxa"/>
+            </w:tcMar>
+            <w:tcBorders>
+              <w:top w:val="single" w:sz="6" w:space="0" w:color="7F7F7F"/>
+              <w:left w:val="single" w:sz="6" w:space="0" w:color="7F7F7F"/>
+              <w:bottom w:val="single" w:sz="6" w:space="0" w:color="7F7F7F"/>
+              <w:right w:val="single" w:sz="6" w:space="0" w:color="7F7F7F"/>
+              <w:insideH w:val="single" w:sz="6" w:space="0" w:color="7F7F7F"/>
+              <w:insideV w:val="single" w:sz="6" w:space="0" w:color="7F7F7F"/>
+            </w:tcBorders>
+          </w:tcPr>
+          <w:p>
+            <w:pPr>
+              <w:spacing w:after="0"/>
+              <w:jc w:val="left"/>
+            </w:pPr>
+            <w:r>
+              <w:rPr>
+                <w:rFonts w:ascii="Times New Roman" w:hAnsi="Times New Roman" w:eastAsia="Times New Roman"/>
+                <w:b w:val="0"/>
+                <w:i w:val="0"/>
+                <w:sz w:val="16"/>
+              </w:rPr>
+            </w:r>
+            <w:r>
+              <w:rPr>
+                <w:rFonts w:ascii="Times New Roman" w:hAnsi="Times New Roman" w:eastAsia="Times New Roman"/>
+                <w:b w:val="0"/>
+                <w:i w:val="0"/>
+                <w:sz w:val="16"/>
+              </w:rPr>
+              <w:t>Trễ hạn</w:t>
+            </w:r>
+          </w:p>
+        </w:tc>
+        <w:tc>
+          <w:tcPr>
+            <w:tcW w:type="dxa" w:w="1474"/>
+            <w:vAlign w:val="center"/>
+            <w:tcMar>
+              <w:top w:w="80" w:type="dxa"/>
+              <w:start w:w="80" w:type="dxa"/>
+              <w:bottom w:w="80" w:type="dxa"/>
+              <w:end w:w="80" w:type="dxa"/>
+            </w:tcMar>
+            <w:tcBorders>
+              <w:top w:val="single" w:sz="6" w:space="0" w:color="7F7F7F"/>
+              <w:left w:val="single" w:sz="6" w:space="0" w:color="7F7F7F"/>
+              <w:bottom w:val="single" w:sz="6" w:space="0" w:color="7F7F7F"/>
+              <w:right w:val="single" w:sz="6" w:space="0" w:color="7F7F7F"/>
+              <w:insideH w:val="single" w:sz="6" w:space="0" w:color="7F7F7F"/>
+              <w:insideV w:val="single" w:sz="6" w:space="0" w:color="7F7F7F"/>
+            </w:tcBorders>
+          </w:tcPr>
+          <w:p>
+            <w:pPr>
+              <w:spacing w:after="0"/>
+              <w:jc w:val="left"/>
+            </w:pPr>
+            <w:r>
+              <w:rPr>
+                <w:rFonts w:ascii="Times New Roman" w:hAnsi="Times New Roman" w:eastAsia="Times New Roman"/>
+                <w:b w:val="0"/>
+                <w:i w:val="0"/>
+                <w:sz w:val="16"/>
+              </w:rPr>
+            </w:r>
+            <w:r>
+              <w:rPr>
+                <w:rFonts w:ascii="Times New Roman" w:hAnsi="Times New Roman" w:eastAsia="Times New Roman"/>
+                <w:b w:val="0"/>
+                <w:i w:val="0"/>
+                <w:sz w:val="16"/>
+              </w:rPr>
+              <w:t>03/08/2026 - 05/08/2026</w:t>
+            </w:r>
+          </w:p>
+        </w:tc>
+        <w:tc>
+          <w:tcPr>
+            <w:tcW w:type="dxa" w:w="3061"/>
+            <w:vAlign w:val="center"/>
+            <w:tcMar>
+              <w:top w:w="80" w:type="dxa"/>
+              <w:start w:w="80" w:type="dxa"/>
+              <w:bottom w:w="80" w:type="dxa"/>
+              <w:end w:w="80" w:type="dxa"/>
+            </w:tcMar>
+            <w:tcBorders>
+              <w:top w:val="single" w:sz="6" w:space="0" w:color="7F7F7F"/>
+              <w:left w:val="single" w:sz="6" w:space="0" w:color="7F7F7F"/>
+              <w:bottom w:val="single" w:sz="6" w:space="0" w:color="7F7F7F"/>
+              <w:right w:val="single" w:sz="6" w:space="0" w:color="7F7F7F"/>
+              <w:insideH w:val="single" w:sz="6" w:space="0" w:color="7F7F7F"/>
+              <w:insideV w:val="single" w:sz="6" w:space="0" w:color="7F7F7F"/>
+            </w:tcBorders>
+          </w:tcPr>
+          <w:p>
+            <w:pPr>
+              <w:spacing w:after="0"/>
+              <w:jc w:val="left"/>
+            </w:pPr>
+            <w:r>
+              <w:rPr>
+                <w:rFonts w:ascii="Times New Roman" w:hAnsi="Times New Roman" w:eastAsia="Times New Roman"/>
+                <w:b w:val="0"/>
+                <w:i w:val="0"/>
+                <w:sz w:val="16"/>
+              </w:rPr>
+            </w:r>
+            <w:r>
+              <w:rPr>
+                <w:rFonts w:ascii="Times New Roman" w:hAnsi="Times New Roman" w:eastAsia="Times New Roman"/>
+                <w:b w:val="0"/>
+                <w:i w:val="0"/>
+                <w:sz w:val="16"/>
+              </w:rPr>
+              <w:t>UploadClientService.cs, FileStream, TcpClient, NetworkStream, Shared protocol</w:t>
+            </w:r>
+          </w:p>
+        </w:tc>
+        <w:tc>
+          <w:tcPr>
+            <w:tcW w:type="dxa" w:w="2664"/>
+            <w:vAlign w:val="center"/>
+            <w:tcMar>
+              <w:top w:w="80" w:type="dxa"/>
+              <w:start w:w="80" w:type="dxa"/>
+              <w:bottom w:w="80" w:type="dxa"/>
+              <w:end w:w="80" w:type="dxa"/>
+            </w:tcMar>
+            <w:tcBorders>
+              <w:top w:val="single" w:sz="6" w:space="0" w:color="7F7F7F"/>
+              <w:left w:val="single" w:sz="6" w:space="0" w:color="7F7F7F"/>
+              <w:bottom w:val="single" w:sz="6" w:space="0" w:color="7F7F7F"/>
+              <w:right w:val="single" w:sz="6" w:space="0" w:color="7F7F7F"/>
+              <w:insideH w:val="single" w:sz="6" w:space="0" w:color="7F7F7F"/>
+              <w:insideV w:val="single" w:sz="6" w:space="0" w:color="7F7F7F"/>
+            </w:tcBorders>
+          </w:tcPr>
+          <w:p>
+            <w:pPr>
+              <w:spacing w:after="0"/>
+              <w:jc w:val="left"/>
+            </w:pPr>
+            <w:r>
+              <w:rPr>
+                <w:rFonts w:ascii="Times New Roman" w:hAnsi="Times New Roman" w:eastAsia="Times New Roman"/>
+                <w:b w:val="0"/>
+                <w:i w:val="0"/>
+                <w:sz w:val="16"/>
+              </w:rPr>
+            </w:r>
+            <w:r>
+              <w:rPr>
+                <w:rFonts w:ascii="Times New Roman" w:hAnsi="Times New Roman" w:eastAsia="Times New Roman"/>
+                <w:b w:val="0"/>
+                <w:i w:val="0"/>
+                <w:sz w:val="16"/>
+              </w:rPr>
+              <w:t>feature/client-single-file-transfer</w:t>
+            </w:r>
+          </w:p>
+        </w:tc>
+      </w:tr>
+      <w:tr>
+        <w:tc>
+          <w:tcPr>
+            <w:tcW w:type="dxa" w:w="2154"/>
+            <w:vAlign w:val="center"/>
+            <w:tcMar>
+              <w:top w:w="80" w:type="dxa"/>
+              <w:start w:w="80" w:type="dxa"/>
+              <w:bottom w:w="80" w:type="dxa"/>
+              <w:end w:w="80" w:type="dxa"/>
+            </w:tcMar>
+            <w:tcBorders>
+              <w:top w:val="single" w:sz="6" w:space="0" w:color="7F7F7F"/>
+              <w:left w:val="single" w:sz="6" w:space="0" w:color="7F7F7F"/>
+              <w:bottom w:val="single" w:sz="6" w:space="0" w:color="7F7F7F"/>
+              <w:right w:val="single" w:sz="6" w:space="0" w:color="7F7F7F"/>
+              <w:insideH w:val="single" w:sz="6" w:space="0" w:color="7F7F7F"/>
+              <w:insideV w:val="single" w:sz="6" w:space="0" w:color="7F7F7F"/>
+            </w:tcBorders>
+          </w:tcPr>
+          <w:p>
+            <w:pPr>
+              <w:spacing w:after="0"/>
+              <w:jc w:val="left"/>
+            </w:pPr>
+            <w:r>
+              <w:rPr>
+                <w:rFonts w:ascii="Times New Roman" w:hAnsi="Times New Roman" w:eastAsia="Times New Roman"/>
+                <w:b w:val="0"/>
+                <w:i w:val="0"/>
+                <w:sz w:val="16"/>
+              </w:rPr>
+            </w:r>
+            <w:r>
+              <w:rPr>
+                <w:rFonts w:ascii="Times New Roman" w:hAnsi="Times New Roman" w:eastAsia="Times New Roman"/>
+                <w:b w:val="0"/>
+                <w:i w:val="0"/>
+                <w:sz w:val="16"/>
+              </w:rPr>
+              <w:t>Server TCP và xử lý kết nối</w:t>
+            </w:r>
+          </w:p>
+        </w:tc>
+        <w:tc>
+          <w:tcPr>
+            <w:tcW w:type="dxa" w:w="1304"/>
+            <w:vAlign w:val="center"/>
+            <w:tcMar>
+              <w:top w:w="80" w:type="dxa"/>
+              <w:start w:w="80" w:type="dxa"/>
+              <w:bottom w:w="80" w:type="dxa"/>
+              <w:end w:w="80" w:type="dxa"/>
+            </w:tcMar>
+            <w:tcBorders>
+              <w:top w:val="single" w:sz="6" w:space="0" w:color="7F7F7F"/>
+              <w:left w:val="single" w:sz="6" w:space="0" w:color="7F7F7F"/>
+              <w:bottom w:val="single" w:sz="6" w:space="0" w:color="7F7F7F"/>
+              <w:right w:val="single" w:sz="6" w:space="0" w:color="7F7F7F"/>
+              <w:insideH w:val="single" w:sz="6" w:space="0" w:color="7F7F7F"/>
+              <w:insideV w:val="single" w:sz="6" w:space="0" w:color="7F7F7F"/>
+            </w:tcBorders>
+          </w:tcPr>
+          <w:p>
+            <w:pPr>
+              <w:spacing w:after="0"/>
+              <w:jc w:val="left"/>
+            </w:pPr>
+            <w:r>
+              <w:rPr>
+                <w:rFonts w:ascii="Times New Roman" w:hAnsi="Times New Roman" w:eastAsia="Times New Roman"/>
+                <w:b w:val="0"/>
+                <w:i w:val="0"/>
+                <w:sz w:val="16"/>
+              </w:rPr>
+            </w:r>
+            <w:r>
+              <w:rPr>
+                <w:rFonts w:ascii="Times New Roman" w:hAnsi="Times New Roman" w:eastAsia="Times New Roman"/>
+                <w:b w:val="0"/>
+                <w:i w:val="0"/>
+                <w:sz w:val="16"/>
+              </w:rPr>
+              <w:t>Anh Kiệt</w:t>
+            </w:r>
+          </w:p>
+        </w:tc>
+        <w:tc>
+          <w:tcPr>
+            <w:tcW w:type="dxa" w:w="680"/>
+            <w:vAlign w:val="center"/>
+            <w:tcMar>
+              <w:top w:w="80" w:type="dxa"/>
+              <w:start w:w="80" w:type="dxa"/>
+              <w:bottom w:w="80" w:type="dxa"/>
+              <w:end w:w="80" w:type="dxa"/>
+            </w:tcMar>
+            <w:tcBorders>
+              <w:top w:val="single" w:sz="6" w:space="0" w:color="7F7F7F"/>
+              <w:left w:val="single" w:sz="6" w:space="0" w:color="7F7F7F"/>
+              <w:bottom w:val="single" w:sz="6" w:space="0" w:color="7F7F7F"/>
+              <w:right w:val="single" w:sz="6" w:space="0" w:color="7F7F7F"/>
+              <w:insideH w:val="single" w:sz="6" w:space="0" w:color="7F7F7F"/>
+              <w:insideV w:val="single" w:sz="6" w:space="0" w:color="7F7F7F"/>
+            </w:tcBorders>
+          </w:tcPr>
+          <w:p>
+            <w:pPr>
+              <w:spacing w:after="0"/>
+              <w:jc w:val="left"/>
+            </w:pPr>
+            <w:r>
+              <w:rPr>
+                <w:rFonts w:ascii="Times New Roman" w:hAnsi="Times New Roman" w:eastAsia="Times New Roman"/>
+                <w:b w:val="0"/>
+                <w:i w:val="0"/>
+                <w:sz w:val="16"/>
+              </w:rPr>
+            </w:r>
+            <w:r>
+              <w:rPr>
+                <w:rFonts w:ascii="Times New Roman" w:hAnsi="Times New Roman" w:eastAsia="Times New Roman"/>
+                <w:b w:val="0"/>
+                <w:i w:val="0"/>
+                <w:sz w:val="16"/>
+              </w:rPr>
+              <w:t>P0</w:t>
+            </w:r>
+          </w:p>
+        </w:tc>
+        <w:tc>
+          <w:tcPr>
+            <w:tcW w:type="dxa" w:w="1190"/>
+            <w:vAlign w:val="center"/>
+            <w:tcMar>
+              <w:top w:w="80" w:type="dxa"/>
+              <w:start w:w="80" w:type="dxa"/>
+              <w:bottom w:w="80" w:type="dxa"/>
+              <w:end w:w="80" w:type="dxa"/>
+            </w:tcMar>
+            <w:tcBorders>
+              <w:top w:val="single" w:sz="6" w:space="0" w:color="7F7F7F"/>
+              <w:left w:val="single" w:sz="6" w:space="0" w:color="7F7F7F"/>
+              <w:bottom w:val="single" w:sz="6" w:space="0" w:color="7F7F7F"/>
+              <w:right w:val="single" w:sz="6" w:space="0" w:color="7F7F7F"/>
+              <w:insideH w:val="single" w:sz="6" w:space="0" w:color="7F7F7F"/>
+              <w:insideV w:val="single" w:sz="6" w:space="0" w:color="7F7F7F"/>
+            </w:tcBorders>
+          </w:tcPr>
+          <w:p>
+            <w:pPr>
+              <w:spacing w:after="0"/>
+              <w:jc w:val="left"/>
+            </w:pPr>
+            <w:r>
+              <w:rPr>
+                <w:rFonts w:ascii="Times New Roman" w:hAnsi="Times New Roman" w:eastAsia="Times New Roman"/>
+                <w:b w:val="0"/>
+                <w:i w:val="0"/>
+                <w:sz w:val="16"/>
+              </w:rPr>
+            </w:r>
+            <w:r>
+              <w:rPr>
+                <w:rFonts w:ascii="Times New Roman" w:hAnsi="Times New Roman" w:eastAsia="Times New Roman"/>
+                <w:b w:val="0"/>
+                <w:i w:val="0"/>
+                <w:sz w:val="16"/>
+              </w:rPr>
+              <w:t>Đã hoàn thành</w:t>
+            </w:r>
+          </w:p>
+        </w:tc>
+        <w:tc>
+          <w:tcPr>
+            <w:tcW w:type="dxa" w:w="1474"/>
+            <w:vAlign w:val="center"/>
+            <w:tcMar>
+              <w:top w:w="80" w:type="dxa"/>
+              <w:start w:w="80" w:type="dxa"/>
+              <w:bottom w:w="80" w:type="dxa"/>
+              <w:end w:w="80" w:type="dxa"/>
+            </w:tcMar>
+            <w:tcBorders>
+              <w:top w:val="single" w:sz="6" w:space="0" w:color="7F7F7F"/>
+              <w:left w:val="single" w:sz="6" w:space="0" w:color="7F7F7F"/>
+              <w:bottom w:val="single" w:sz="6" w:space="0" w:color="7F7F7F"/>
+              <w:right w:val="single" w:sz="6" w:space="0" w:color="7F7F7F"/>
+              <w:insideH w:val="single" w:sz="6" w:space="0" w:color="7F7F7F"/>
+              <w:insideV w:val="single" w:sz="6" w:space="0" w:color="7F7F7F"/>
+            </w:tcBorders>
+          </w:tcPr>
+          <w:p>
+            <w:pPr>
+              <w:spacing w:after="0"/>
+              <w:jc w:val="left"/>
+            </w:pPr>
+            <w:r>
+              <w:rPr>
+                <w:rFonts w:ascii="Times New Roman" w:hAnsi="Times New Roman" w:eastAsia="Times New Roman"/>
+                <w:b w:val="0"/>
+                <w:i w:val="0"/>
+                <w:sz w:val="16"/>
+              </w:rPr>
+            </w:r>
+            <w:r>
+              <w:rPr>
+                <w:rFonts w:ascii="Times New Roman" w:hAnsi="Times New Roman" w:eastAsia="Times New Roman"/>
+                <w:b w:val="0"/>
+                <w:i w:val="0"/>
+                <w:sz w:val="16"/>
+              </w:rPr>
+              <w:t>03/08/2026 - 05/08/2026</w:t>
+            </w:r>
+          </w:p>
+        </w:tc>
+        <w:tc>
+          <w:tcPr>
+            <w:tcW w:type="dxa" w:w="3061"/>
+            <w:vAlign w:val="center"/>
+            <w:tcMar>
+              <w:top w:w="80" w:type="dxa"/>
+              <w:start w:w="80" w:type="dxa"/>
+              <w:bottom w:w="80" w:type="dxa"/>
+              <w:end w:w="80" w:type="dxa"/>
+            </w:tcMar>
+            <w:tcBorders>
+              <w:top w:val="single" w:sz="6" w:space="0" w:color="7F7F7F"/>
+              <w:left w:val="single" w:sz="6" w:space="0" w:color="7F7F7F"/>
+              <w:bottom w:val="single" w:sz="6" w:space="0" w:color="7F7F7F"/>
+              <w:right w:val="single" w:sz="6" w:space="0" w:color="7F7F7F"/>
+              <w:insideH w:val="single" w:sz="6" w:space="0" w:color="7F7F7F"/>
+              <w:insideV w:val="single" w:sz="6" w:space="0" w:color="7F7F7F"/>
+            </w:tcBorders>
+          </w:tcPr>
+          <w:p>
+            <w:pPr>
+              <w:spacing w:after="0"/>
+              <w:jc w:val="left"/>
+            </w:pPr>
+            <w:r>
+              <w:rPr>
+                <w:rFonts w:ascii="Times New Roman" w:hAnsi="Times New Roman" w:eastAsia="Times New Roman"/>
+                <w:b w:val="0"/>
+                <w:i w:val="0"/>
+                <w:sz w:val="16"/>
+              </w:rPr>
+            </w:r>
+            <w:r>
+              <w:rPr>
+                <w:rFonts w:ascii="Times New Roman" w:hAnsi="Times New Roman" w:eastAsia="Times New Roman"/>
+                <w:b w:val="0"/>
+                <w:i w:val="0"/>
+                <w:sz w:val="16"/>
+              </w:rPr>
+              <w:t>Program.cs, UploadServer.cs, ClientConnectionHandler.cs, MetadataValidator.cs, Shared protocol</w:t>
+            </w:r>
+          </w:p>
+        </w:tc>
+        <w:tc>
+          <w:tcPr>
+            <w:tcW w:type="dxa" w:w="2664"/>
+            <w:vAlign w:val="center"/>
+            <w:tcMar>
+              <w:top w:w="80" w:type="dxa"/>
+              <w:start w:w="80" w:type="dxa"/>
+              <w:bottom w:w="80" w:type="dxa"/>
+              <w:end w:w="80" w:type="dxa"/>
+            </w:tcMar>
+            <w:tcBorders>
+              <w:top w:val="single" w:sz="6" w:space="0" w:color="7F7F7F"/>
+              <w:left w:val="single" w:sz="6" w:space="0" w:color="7F7F7F"/>
+              <w:bottom w:val="single" w:sz="6" w:space="0" w:color="7F7F7F"/>
+              <w:right w:val="single" w:sz="6" w:space="0" w:color="7F7F7F"/>
+              <w:insideH w:val="single" w:sz="6" w:space="0" w:color="7F7F7F"/>
+              <w:insideV w:val="single" w:sz="6" w:space="0" w:color="7F7F7F"/>
+            </w:tcBorders>
+          </w:tcPr>
+          <w:p>
+            <w:pPr>
+              <w:spacing w:after="0"/>
+              <w:jc w:val="left"/>
+            </w:pPr>
+            <w:r>
+              <w:rPr>
+                <w:rFonts w:ascii="Times New Roman" w:hAnsi="Times New Roman" w:eastAsia="Times New Roman"/>
+                <w:b w:val="0"/>
+                <w:i w:val="0"/>
+                <w:sz w:val="16"/>
+              </w:rPr>
+            </w:r>
+            <w:r>
+              <w:rPr>
+                <w:rFonts w:ascii="Times New Roman" w:hAnsi="Times New Roman" w:eastAsia="Times New Roman"/>
+                <w:b w:val="0"/>
+                <w:i w:val="0"/>
+                <w:sz w:val="16"/>
+              </w:rPr>
+              <w:t>feature/server-tcp-listener</w:t>
+            </w:r>
+          </w:p>
+        </w:tc>
+      </w:tr>
+      <w:tr>
+        <w:tc>
+          <w:tcPr>
+            <w:tcW w:type="dxa" w:w="2154"/>
+            <w:vAlign w:val="center"/>
+            <w:tcMar>
+              <w:top w:w="80" w:type="dxa"/>
+              <w:start w:w="80" w:type="dxa"/>
+              <w:bottom w:w="80" w:type="dxa"/>
+              <w:end w:w="80" w:type="dxa"/>
+            </w:tcMar>
+            <w:tcBorders>
+              <w:top w:val="single" w:sz="6" w:space="0" w:color="7F7F7F"/>
+              <w:left w:val="single" w:sz="6" w:space="0" w:color="7F7F7F"/>
+              <w:bottom w:val="single" w:sz="6" w:space="0" w:color="7F7F7F"/>
+              <w:right w:val="single" w:sz="6" w:space="0" w:color="7F7F7F"/>
+              <w:insideH w:val="single" w:sz="6" w:space="0" w:color="7F7F7F"/>
+              <w:insideV w:val="single" w:sz="6" w:space="0" w:color="7F7F7F"/>
+            </w:tcBorders>
+          </w:tcPr>
+          <w:p>
+            <w:pPr>
+              <w:spacing w:after="0"/>
+              <w:jc w:val="left"/>
+            </w:pPr>
+            <w:r>
+              <w:rPr>
+                <w:rFonts w:ascii="Times New Roman" w:hAnsi="Times New Roman" w:eastAsia="Times New Roman"/>
+                <w:b w:val="0"/>
+                <w:i w:val="0"/>
+                <w:sz w:val="16"/>
+              </w:rPr>
+            </w:r>
+            <w:r>
+              <w:rPr>
+                <w:rFonts w:ascii="Times New Roman" w:hAnsi="Times New Roman" w:eastAsia="Times New Roman"/>
+                <w:b w:val="0"/>
+                <w:i w:val="0"/>
+                <w:sz w:val="16"/>
+              </w:rPr>
+              <w:t>Server lưu file, log và kiểm thử tích hợp</w:t>
+            </w:r>
+          </w:p>
+        </w:tc>
+        <w:tc>
+          <w:tcPr>
+            <w:tcW w:type="dxa" w:w="1304"/>
+            <w:vAlign w:val="center"/>
+            <w:tcMar>
+              <w:top w:w="80" w:type="dxa"/>
+              <w:start w:w="80" w:type="dxa"/>
+              <w:bottom w:w="80" w:type="dxa"/>
+              <w:end w:w="80" w:type="dxa"/>
+            </w:tcMar>
+            <w:tcBorders>
+              <w:top w:val="single" w:sz="6" w:space="0" w:color="7F7F7F"/>
+              <w:left w:val="single" w:sz="6" w:space="0" w:color="7F7F7F"/>
+              <w:bottom w:val="single" w:sz="6" w:space="0" w:color="7F7F7F"/>
+              <w:right w:val="single" w:sz="6" w:space="0" w:color="7F7F7F"/>
+              <w:insideH w:val="single" w:sz="6" w:space="0" w:color="7F7F7F"/>
+              <w:insideV w:val="single" w:sz="6" w:space="0" w:color="7F7F7F"/>
+            </w:tcBorders>
+          </w:tcPr>
+          <w:p>
+            <w:pPr>
+              <w:spacing w:after="0"/>
+              <w:jc w:val="left"/>
+            </w:pPr>
+            <w:r>
+              <w:rPr>
+                <w:rFonts w:ascii="Times New Roman" w:hAnsi="Times New Roman" w:eastAsia="Times New Roman"/>
+                <w:b w:val="0"/>
+                <w:i w:val="0"/>
+                <w:sz w:val="16"/>
+              </w:rPr>
+            </w:r>
+            <w:r>
+              <w:rPr>
+                <w:rFonts w:ascii="Times New Roman" w:hAnsi="Times New Roman" w:eastAsia="Times New Roman"/>
+                <w:b w:val="0"/>
+                <w:i w:val="0"/>
+                <w:sz w:val="16"/>
+              </w:rPr>
+              <w:t>Nhật Linh</w:t>
+            </w:r>
+          </w:p>
+        </w:tc>
+        <w:tc>
+          <w:tcPr>
+            <w:tcW w:type="dxa" w:w="680"/>
+            <w:vAlign w:val="center"/>
+            <w:tcMar>
+              <w:top w:w="80" w:type="dxa"/>
+              <w:start w:w="80" w:type="dxa"/>
+              <w:bottom w:w="80" w:type="dxa"/>
+              <w:end w:w="80" w:type="dxa"/>
+            </w:tcMar>
+            <w:tcBorders>
+              <w:top w:val="single" w:sz="6" w:space="0" w:color="7F7F7F"/>
+              <w:left w:val="single" w:sz="6" w:space="0" w:color="7F7F7F"/>
+              <w:bottom w:val="single" w:sz="6" w:space="0" w:color="7F7F7F"/>
+              <w:right w:val="single" w:sz="6" w:space="0" w:color="7F7F7F"/>
+              <w:insideH w:val="single" w:sz="6" w:space="0" w:color="7F7F7F"/>
+              <w:insideV w:val="single" w:sz="6" w:space="0" w:color="7F7F7F"/>
+            </w:tcBorders>
+          </w:tcPr>
+          <w:p>
+            <w:pPr>
+              <w:spacing w:after="0"/>
+              <w:jc w:val="left"/>
+            </w:pPr>
+            <w:r>
+              <w:rPr>
+                <w:rFonts w:ascii="Times New Roman" w:hAnsi="Times New Roman" w:eastAsia="Times New Roman"/>
+                <w:b w:val="0"/>
+                <w:i w:val="0"/>
+                <w:sz w:val="16"/>
+              </w:rPr>
+            </w:r>
+            <w:r>
+              <w:rPr>
+                <w:rFonts w:ascii="Times New Roman" w:hAnsi="Times New Roman" w:eastAsia="Times New Roman"/>
+                <w:b w:val="0"/>
+                <w:i w:val="0"/>
+                <w:sz w:val="16"/>
+              </w:rPr>
+              <w:t>P0</w:t>
+            </w:r>
+          </w:p>
+        </w:tc>
+        <w:tc>
+          <w:tcPr>
+            <w:tcW w:type="dxa" w:w="1190"/>
+            <w:vAlign w:val="center"/>
+            <w:tcMar>
+              <w:top w:w="80" w:type="dxa"/>
+              <w:start w:w="80" w:type="dxa"/>
+              <w:bottom w:w="80" w:type="dxa"/>
+              <w:end w:w="80" w:type="dxa"/>
+            </w:tcMar>
+            <w:tcBorders>
+              <w:top w:val="single" w:sz="6" w:space="0" w:color="7F7F7F"/>
+              <w:left w:val="single" w:sz="6" w:space="0" w:color="7F7F7F"/>
+              <w:bottom w:val="single" w:sz="6" w:space="0" w:color="7F7F7F"/>
+              <w:right w:val="single" w:sz="6" w:space="0" w:color="7F7F7F"/>
+              <w:insideH w:val="single" w:sz="6" w:space="0" w:color="7F7F7F"/>
+              <w:insideV w:val="single" w:sz="6" w:space="0" w:color="7F7F7F"/>
+            </w:tcBorders>
+          </w:tcPr>
+          <w:p>
+            <w:pPr>
+              <w:spacing w:after="0"/>
+              <w:jc w:val="left"/>
+            </w:pPr>
+            <w:r>
+              <w:rPr>
+                <w:rFonts w:ascii="Times New Roman" w:hAnsi="Times New Roman" w:eastAsia="Times New Roman"/>
+                <w:b w:val="0"/>
+                <w:i w:val="0"/>
+                <w:sz w:val="16"/>
+              </w:rPr>
+            </w:r>
+            <w:r>
+              <w:rPr>
+                <w:rFonts w:ascii="Times New Roman" w:hAnsi="Times New Roman" w:eastAsia="Times New Roman"/>
+                <w:b w:val="0"/>
+                <w:i w:val="0"/>
+                <w:sz w:val="16"/>
+              </w:rPr>
+              <w:t>Đã hoàn thành</w:t>
+            </w:r>
+          </w:p>
+        </w:tc>
+        <w:tc>
+          <w:tcPr>
+            <w:tcW w:type="dxa" w:w="1474"/>
+            <w:vAlign w:val="center"/>
+            <w:tcMar>
+              <w:top w:w="80" w:type="dxa"/>
+              <w:start w:w="80" w:type="dxa"/>
+              <w:bottom w:w="80" w:type="dxa"/>
+              <w:end w:w="80" w:type="dxa"/>
+            </w:tcMar>
+            <w:tcBorders>
+              <w:top w:val="single" w:sz="6" w:space="0" w:color="7F7F7F"/>
+              <w:left w:val="single" w:sz="6" w:space="0" w:color="7F7F7F"/>
+              <w:bottom w:val="single" w:sz="6" w:space="0" w:color="7F7F7F"/>
+              <w:right w:val="single" w:sz="6" w:space="0" w:color="7F7F7F"/>
+              <w:insideH w:val="single" w:sz="6" w:space="0" w:color="7F7F7F"/>
+              <w:insideV w:val="single" w:sz="6" w:space="0" w:color="7F7F7F"/>
+            </w:tcBorders>
+          </w:tcPr>
+          <w:p>
+            <w:pPr>
+              <w:spacing w:after="0"/>
+              <w:jc w:val="left"/>
+            </w:pPr>
+            <w:r>
+              <w:rPr>
+                <w:rFonts w:ascii="Times New Roman" w:hAnsi="Times New Roman" w:eastAsia="Times New Roman"/>
+                <w:b w:val="0"/>
+                <w:i w:val="0"/>
+                <w:sz w:val="16"/>
+              </w:rPr>
+            </w:r>
+            <w:r>
+              <w:rPr>
+                <w:rFonts w:ascii="Times New Roman" w:hAnsi="Times New Roman" w:eastAsia="Times New Roman"/>
+                <w:b w:val="0"/>
+                <w:i w:val="0"/>
+                <w:sz w:val="16"/>
+              </w:rPr>
+              <w:t>03/08/2026 - 07/08/2026</w:t>
+            </w:r>
+          </w:p>
+        </w:tc>
+        <w:tc>
+          <w:tcPr>
+            <w:tcW w:type="dxa" w:w="3061"/>
+            <w:vAlign w:val="center"/>
+            <w:tcMar>
+              <w:top w:w="80" w:type="dxa"/>
+              <w:start w:w="80" w:type="dxa"/>
+              <w:bottom w:w="80" w:type="dxa"/>
+              <w:end w:w="80" w:type="dxa"/>
+            </w:tcMar>
+            <w:tcBorders>
+              <w:top w:val="single" w:sz="6" w:space="0" w:color="7F7F7F"/>
+              <w:left w:val="single" w:sz="6" w:space="0" w:color="7F7F7F"/>
+              <w:bottom w:val="single" w:sz="6" w:space="0" w:color="7F7F7F"/>
+              <w:right w:val="single" w:sz="6" w:space="0" w:color="7F7F7F"/>
+              <w:insideH w:val="single" w:sz="6" w:space="0" w:color="7F7F7F"/>
+              <w:insideV w:val="single" w:sz="6" w:space="0" w:color="7F7F7F"/>
+            </w:tcBorders>
+          </w:tcPr>
+          <w:p>
+            <w:pPr>
+              <w:spacing w:after="0"/>
+              <w:jc w:val="left"/>
+            </w:pPr>
+            <w:r>
+              <w:rPr>
+                <w:rFonts w:ascii="Times New Roman" w:hAnsi="Times New Roman" w:eastAsia="Times New Roman"/>
+                <w:b w:val="0"/>
+                <w:i w:val="0"/>
+                <w:sz w:val="16"/>
+              </w:rPr>
+            </w:r>
+            <w:r>
+              <w:rPr>
+                <w:rFonts w:ascii="Times New Roman" w:hAnsi="Times New Roman" w:eastAsia="Times New Roman"/>
+                <w:b w:val="0"/>
+                <w:i w:val="0"/>
+                <w:sz w:val="16"/>
+              </w:rPr>
+              <w:t>FileStorageService.cs, ServerLogger.cs, Extra/TestData, Extra/TestLogs, Extra/Screenshots</w:t>
+            </w:r>
+          </w:p>
+        </w:tc>
+        <w:tc>
+          <w:tcPr>
+            <w:tcW w:type="dxa" w:w="2664"/>
+            <w:vAlign w:val="center"/>
+            <w:tcMar>
+              <w:top w:w="80" w:type="dxa"/>
+              <w:start w:w="80" w:type="dxa"/>
+              <w:bottom w:w="80" w:type="dxa"/>
+              <w:end w:w="80" w:type="dxa"/>
+            </w:tcMar>
+            <w:tcBorders>
+              <w:top w:val="single" w:sz="6" w:space="0" w:color="7F7F7F"/>
+              <w:left w:val="single" w:sz="6" w:space="0" w:color="7F7F7F"/>
+              <w:bottom w:val="single" w:sz="6" w:space="0" w:color="7F7F7F"/>
+              <w:right w:val="single" w:sz="6" w:space="0" w:color="7F7F7F"/>
+              <w:insideH w:val="single" w:sz="6" w:space="0" w:color="7F7F7F"/>
+              <w:insideV w:val="single" w:sz="6" w:space="0" w:color="7F7F7F"/>
+            </w:tcBorders>
+          </w:tcPr>
+          <w:p>
+            <w:pPr>
+              <w:spacing w:after="0"/>
+              <w:jc w:val="left"/>
+            </w:pPr>
+            <w:r>
+              <w:rPr>
+                <w:rFonts w:ascii="Times New Roman" w:hAnsi="Times New Roman" w:eastAsia="Times New Roman"/>
+                <w:b w:val="0"/>
+                <w:i w:val="0"/>
+                <w:sz w:val="16"/>
+              </w:rPr>
+            </w:r>
+            <w:r>
+              <w:rPr>
+                <w:rFonts w:ascii="Times New Roman" w:hAnsi="Times New Roman" w:eastAsia="Times New Roman"/>
+                <w:b w:val="0"/>
+                <w:i w:val="0"/>
+                <w:sz w:val="16"/>
+              </w:rPr>
+              <w:t>feature/server-basic-file-storage</w:t>
+            </w:r>
+          </w:p>
+        </w:tc>
+      </w:tr>
+    </w:tbl>
+    <w:p>
+      <w:r>
+        <w:br w:type="page"/>
+      </w:r>
+    </w:p>
+    <w:p>
+      <w:pPr>
+        <w:spacing w:before="160" w:after="60"/>
+      </w:pPr>
+      <w:r>
+        <w:rPr>
+          <w:rFonts w:ascii="Times New Roman" w:hAnsi="Times New Roman" w:eastAsia="Times New Roman"/>
+          <w:b/>
+          <w:i w:val="0"/>
+          <w:sz w:val="22"/>
+        </w:rPr>
+        <w:t>Bảng 2. Nội dung nhiệm vụ và sản phẩm cần đạt</w:t>
+      </w:r>
+    </w:p>
+    <w:tbl>
+      <w:tblPr>
+        <w:tblW w:type="auto" w:w="0"/>
+        <w:jc w:val="center"/>
+        <w:tblLook w:firstColumn="1" w:firstRow="1" w:lastColumn="0" w:lastRow="0" w:noHBand="0" w:noVBand="1" w:val="04A0"/>
+      </w:tblPr>
+      <w:tblGrid>
+        <w:gridCol w:w="5159"/>
+        <w:gridCol w:w="5159"/>
+        <w:gridCol w:w="5159"/>
+      </w:tblGrid>
+      <w:tr>
+        <w:tc>
+          <w:tcPr>
+            <w:tcW w:type="dxa" w:w="2381"/>
+            <w:vAlign w:val="center"/>
+            <w:tcMar>
+              <w:top w:w="80" w:type="dxa"/>
+              <w:start w:w="80" w:type="dxa"/>
+              <w:bottom w:w="80" w:type="dxa"/>
+              <w:end w:w="80" w:type="dxa"/>
+            </w:tcMar>
+            <w:tcBorders>
+              <w:top w:val="single" w:sz="6" w:space="0" w:color="7F7F7F"/>
+              <w:left w:val="single" w:sz="6" w:space="0" w:color="7F7F7F"/>
+              <w:bottom w:val="single" w:sz="6" w:space="0" w:color="7F7F7F"/>
+              <w:right w:val="single" w:sz="6" w:space="0" w:color="7F7F7F"/>
+              <w:insideH w:val="single" w:sz="6" w:space="0" w:color="7F7F7F"/>
+              <w:insideV w:val="single" w:sz="6" w:space="0" w:color="7F7F7F"/>
+            </w:tcBorders>
+            <w:shd w:fill="1F4E79"/>
+          </w:tcPr>
+          <w:p>
+            <w:pPr>
+              <w:spacing w:after="0"/>
+              <w:jc w:val="center"/>
+            </w:pPr>
+            <w:r>
+              <w:rPr>
+                <w:rFonts w:ascii="Times New Roman" w:hAnsi="Times New Roman" w:eastAsia="Times New Roman"/>
+                <w:b/>
+                <w:i w:val="0"/>
+                <w:color w:val="FFFFFF"/>
+                <w:sz w:val="16"/>
+              </w:rPr>
+            </w:r>
+            <w:r>
+              <w:rPr>
+                <w:rFonts w:ascii="Times New Roman" w:hAnsi="Times New Roman" w:eastAsia="Times New Roman"/>
+                <w:b/>
+                <w:i w:val="0"/>
+                <w:color w:val="FFFFFF"/>
+                <w:sz w:val="16"/>
+              </w:rPr>
+              <w:t>Role/feature phụ trách</w:t>
+            </w:r>
+          </w:p>
+        </w:tc>
+        <w:tc>
+          <w:tcPr>
+            <w:tcW w:type="dxa" w:w="6350"/>
+            <w:vAlign w:val="center"/>
+            <w:tcMar>
+              <w:top w:w="80" w:type="dxa"/>
+              <w:start w:w="80" w:type="dxa"/>
+              <w:bottom w:w="80" w:type="dxa"/>
+              <w:end w:w="80" w:type="dxa"/>
+            </w:tcMar>
+            <w:tcBorders>
+              <w:top w:val="single" w:sz="6" w:space="0" w:color="7F7F7F"/>
+              <w:left w:val="single" w:sz="6" w:space="0" w:color="7F7F7F"/>
+              <w:bottom w:val="single" w:sz="6" w:space="0" w:color="7F7F7F"/>
+              <w:right w:val="single" w:sz="6" w:space="0" w:color="7F7F7F"/>
+              <w:insideH w:val="single" w:sz="6" w:space="0" w:color="7F7F7F"/>
+              <w:insideV w:val="single" w:sz="6" w:space="0" w:color="7F7F7F"/>
+            </w:tcBorders>
+            <w:shd w:fill="1F4E79"/>
+          </w:tcPr>
+          <w:p>
+            <w:pPr>
+              <w:spacing w:after="0"/>
+              <w:jc w:val="center"/>
+            </w:pPr>
+            <w:r>
+              <w:rPr>
+                <w:rFonts w:ascii="Times New Roman" w:hAnsi="Times New Roman" w:eastAsia="Times New Roman"/>
+                <w:b/>
+                <w:i w:val="0"/>
+                <w:color w:val="FFFFFF"/>
+                <w:sz w:val="16"/>
+              </w:rPr>
+            </w:r>
+            <w:r>
+              <w:rPr>
+                <w:rFonts w:ascii="Times New Roman" w:hAnsi="Times New Roman" w:eastAsia="Times New Roman"/>
+                <w:b/>
+                <w:i w:val="0"/>
+                <w:color w:val="FFFFFF"/>
+                <w:sz w:val="16"/>
+              </w:rPr>
+              <w:t>Nhiệm vụ</w:t>
+            </w:r>
+          </w:p>
+        </w:tc>
+        <w:tc>
+          <w:tcPr>
+            <w:tcW w:type="dxa" w:w="4762"/>
+            <w:vAlign w:val="center"/>
+            <w:tcMar>
+              <w:top w:w="80" w:type="dxa"/>
+              <w:start w:w="80" w:type="dxa"/>
+              <w:bottom w:w="80" w:type="dxa"/>
+              <w:end w:w="80" w:type="dxa"/>
+            </w:tcMar>
+            <w:tcBorders>
+              <w:top w:val="single" w:sz="6" w:space="0" w:color="7F7F7F"/>
+              <w:left w:val="single" w:sz="6" w:space="0" w:color="7F7F7F"/>
+              <w:bottom w:val="single" w:sz="6" w:space="0" w:color="7F7F7F"/>
+              <w:right w:val="single" w:sz="6" w:space="0" w:color="7F7F7F"/>
+              <w:insideH w:val="single" w:sz="6" w:space="0" w:color="7F7F7F"/>
+              <w:insideV w:val="single" w:sz="6" w:space="0" w:color="7F7F7F"/>
+            </w:tcBorders>
+            <w:shd w:fill="1F4E79"/>
+          </w:tcPr>
+          <w:p>
+            <w:pPr>
+              <w:spacing w:after="0"/>
+              <w:jc w:val="center"/>
+            </w:pPr>
+            <w:r>
+              <w:rPr>
+                <w:rFonts w:ascii="Times New Roman" w:hAnsi="Times New Roman" w:eastAsia="Times New Roman"/>
+                <w:b/>
+                <w:i w:val="0"/>
+                <w:color w:val="FFFFFF"/>
+                <w:sz w:val="16"/>
+              </w:rPr>
+            </w:r>
+            <w:r>
+              <w:rPr>
+                <w:rFonts w:ascii="Times New Roman" w:hAnsi="Times New Roman" w:eastAsia="Times New Roman"/>
+                <w:b/>
+                <w:i w:val="0"/>
+                <w:color w:val="FFFFFF"/>
+                <w:sz w:val="16"/>
+              </w:rPr>
+              <w:t>Sản phẩm</w:t>
+            </w:r>
+          </w:p>
+        </w:tc>
+      </w:tr>
+      <w:tr>
+        <w:tc>
+          <w:tcPr>
+            <w:tcW w:type="dxa" w:w="2381"/>
+            <w:vAlign w:val="center"/>
+            <w:tcMar>
+              <w:top w:w="80" w:type="dxa"/>
+              <w:start w:w="80" w:type="dxa"/>
+              <w:bottom w:w="80" w:type="dxa"/>
+              <w:end w:w="80" w:type="dxa"/>
+            </w:tcMar>
+            <w:tcBorders>
+              <w:top w:val="single" w:sz="6" w:space="0" w:color="7F7F7F"/>
+              <w:left w:val="single" w:sz="6" w:space="0" w:color="7F7F7F"/>
+              <w:bottom w:val="single" w:sz="6" w:space="0" w:color="7F7F7F"/>
+              <w:right w:val="single" w:sz="6" w:space="0" w:color="7F7F7F"/>
+              <w:insideH w:val="single" w:sz="6" w:space="0" w:color="7F7F7F"/>
+              <w:insideV w:val="single" w:sz="6" w:space="0" w:color="7F7F7F"/>
+            </w:tcBorders>
+          </w:tcPr>
+          <w:p>
+            <w:pPr>
+              <w:spacing w:after="0"/>
+              <w:jc w:val="left"/>
+            </w:pPr>
+            <w:r>
+              <w:rPr>
+                <w:rFonts w:ascii="Times New Roman" w:hAnsi="Times New Roman" w:eastAsia="Times New Roman"/>
+                <w:b w:val="0"/>
+                <w:i w:val="0"/>
+                <w:sz w:val="16"/>
+              </w:rPr>
+            </w:r>
+            <w:r>
+              <w:rPr>
+                <w:rFonts w:ascii="Times New Roman" w:hAnsi="Times New Roman" w:eastAsia="Times New Roman"/>
+                <w:b w:val="0"/>
+                <w:i w:val="0"/>
+                <w:sz w:val="16"/>
+              </w:rPr>
+              <w:t>Khởi tạo repository và solution</w:t>
+            </w:r>
+          </w:p>
+        </w:tc>
+        <w:tc>
+          <w:tcPr>
+            <w:tcW w:type="dxa" w:w="6350"/>
+            <w:vAlign w:val="center"/>
+            <w:tcMar>
+              <w:top w:w="80" w:type="dxa"/>
+              <w:start w:w="80" w:type="dxa"/>
+              <w:bottom w:w="80" w:type="dxa"/>
+              <w:end w:w="80" w:type="dxa"/>
+            </w:tcMar>
+            <w:tcBorders>
+              <w:top w:val="single" w:sz="6" w:space="0" w:color="7F7F7F"/>
+              <w:left w:val="single" w:sz="6" w:space="0" w:color="7F7F7F"/>
+              <w:bottom w:val="single" w:sz="6" w:space="0" w:color="7F7F7F"/>
+              <w:right w:val="single" w:sz="6" w:space="0" w:color="7F7F7F"/>
+              <w:insideH w:val="single" w:sz="6" w:space="0" w:color="7F7F7F"/>
+              <w:insideV w:val="single" w:sz="6" w:space="0" w:color="7F7F7F"/>
+            </w:tcBorders>
+          </w:tcPr>
+          <w:p>
+            <w:pPr>
+              <w:spacing w:after="0"/>
+              <w:jc w:val="left"/>
+            </w:pPr>
+            <w:r>
+              <w:rPr>
+                <w:rFonts w:ascii="Times New Roman" w:hAnsi="Times New Roman" w:eastAsia="Times New Roman"/>
+                <w:b w:val="0"/>
+                <w:i w:val="0"/>
+                <w:sz w:val="16"/>
+              </w:rPr>
+            </w:r>
+            <w:r>
+              <w:rPr>
+                <w:rFonts w:ascii="Times New Roman" w:hAnsi="Times New Roman" w:eastAsia="Times New Roman"/>
+                <w:b w:val="0"/>
+                <w:i w:val="0"/>
+                <w:sz w:val="16"/>
+              </w:rPr>
+              <w:t>Sửa cấu trúc repository; tạo solution; tạo ba project Client, Server, Shared; thiết lập project reference</w:t>
+            </w:r>
+          </w:p>
+        </w:tc>
+        <w:tc>
+          <w:tcPr>
+            <w:tcW w:type="dxa" w:w="4762"/>
+            <w:vAlign w:val="center"/>
+            <w:tcMar>
+              <w:top w:w="80" w:type="dxa"/>
+              <w:start w:w="80" w:type="dxa"/>
+              <w:bottom w:w="80" w:type="dxa"/>
+              <w:end w:w="80" w:type="dxa"/>
+            </w:tcMar>
+            <w:tcBorders>
+              <w:top w:val="single" w:sz="6" w:space="0" w:color="7F7F7F"/>
+              <w:left w:val="single" w:sz="6" w:space="0" w:color="7F7F7F"/>
+              <w:bottom w:val="single" w:sz="6" w:space="0" w:color="7F7F7F"/>
+              <w:right w:val="single" w:sz="6" w:space="0" w:color="7F7F7F"/>
+              <w:insideH w:val="single" w:sz="6" w:space="0" w:color="7F7F7F"/>
+              <w:insideV w:val="single" w:sz="6" w:space="0" w:color="7F7F7F"/>
+            </w:tcBorders>
+          </w:tcPr>
+          <w:p>
+            <w:pPr>
+              <w:spacing w:after="0"/>
+              <w:jc w:val="left"/>
+            </w:pPr>
+            <w:r>
+              <w:rPr>
+                <w:rFonts w:ascii="Times New Roman" w:hAnsi="Times New Roman" w:eastAsia="Times New Roman"/>
+                <w:b w:val="0"/>
+                <w:i w:val="0"/>
+                <w:sz w:val="16"/>
+              </w:rPr>
+            </w:r>
+            <w:r>
+              <w:rPr>
+                <w:rFonts w:ascii="Times New Roman" w:hAnsi="Times New Roman" w:eastAsia="Times New Roman"/>
+                <w:b w:val="0"/>
+                <w:i w:val="0"/>
+                <w:sz w:val="16"/>
+              </w:rPr>
+              <w:t>Repository đúng cấu trúc; solution build thành công</w:t>
+            </w:r>
+          </w:p>
+        </w:tc>
+      </w:tr>
+      <w:tr>
+        <w:tc>
+          <w:tcPr>
+            <w:tcW w:type="dxa" w:w="2381"/>
+            <w:vAlign w:val="center"/>
+            <w:tcMar>
+              <w:top w:w="80" w:type="dxa"/>
+              <w:start w:w="80" w:type="dxa"/>
+              <w:bottom w:w="80" w:type="dxa"/>
+              <w:end w:w="80" w:type="dxa"/>
+            </w:tcMar>
+            <w:tcBorders>
+              <w:top w:val="single" w:sz="6" w:space="0" w:color="7F7F7F"/>
+              <w:left w:val="single" w:sz="6" w:space="0" w:color="7F7F7F"/>
+              <w:bottom w:val="single" w:sz="6" w:space="0" w:color="7F7F7F"/>
+              <w:right w:val="single" w:sz="6" w:space="0" w:color="7F7F7F"/>
+              <w:insideH w:val="single" w:sz="6" w:space="0" w:color="7F7F7F"/>
+              <w:insideV w:val="single" w:sz="6" w:space="0" w:color="7F7F7F"/>
+            </w:tcBorders>
+          </w:tcPr>
+          <w:p>
+            <w:pPr>
+              <w:spacing w:after="0"/>
+              <w:jc w:val="left"/>
+            </w:pPr>
+            <w:r>
+              <w:rPr>
+                <w:rFonts w:ascii="Times New Roman" w:hAnsi="Times New Roman" w:eastAsia="Times New Roman"/>
+                <w:b w:val="0"/>
+                <w:i w:val="0"/>
+                <w:sz w:val="16"/>
+              </w:rPr>
+            </w:r>
+            <w:r>
+              <w:rPr>
+                <w:rFonts w:ascii="Times New Roman" w:hAnsi="Times New Roman" w:eastAsia="Times New Roman"/>
+                <w:b w:val="0"/>
+                <w:i w:val="0"/>
+                <w:sz w:val="16"/>
+              </w:rPr>
+              <w:t>Shared protocol phiên bản 1</w:t>
+            </w:r>
+          </w:p>
+        </w:tc>
+        <w:tc>
+          <w:tcPr>
+            <w:tcW w:type="dxa" w:w="6350"/>
+            <w:vAlign w:val="center"/>
+            <w:tcMar>
+              <w:top w:w="80" w:type="dxa"/>
+              <w:start w:w="80" w:type="dxa"/>
+              <w:bottom w:w="80" w:type="dxa"/>
+              <w:end w:w="80" w:type="dxa"/>
+            </w:tcMar>
+            <w:tcBorders>
+              <w:top w:val="single" w:sz="6" w:space="0" w:color="7F7F7F"/>
+              <w:left w:val="single" w:sz="6" w:space="0" w:color="7F7F7F"/>
+              <w:bottom w:val="single" w:sz="6" w:space="0" w:color="7F7F7F"/>
+              <w:right w:val="single" w:sz="6" w:space="0" w:color="7F7F7F"/>
+              <w:insideH w:val="single" w:sz="6" w:space="0" w:color="7F7F7F"/>
+              <w:insideV w:val="single" w:sz="6" w:space="0" w:color="7F7F7F"/>
+            </w:tcBorders>
+          </w:tcPr>
+          <w:p>
+            <w:pPr>
+              <w:spacing w:after="0"/>
+              <w:jc w:val="left"/>
+            </w:pPr>
+            <w:r>
+              <w:rPr>
+                <w:rFonts w:ascii="Times New Roman" w:hAnsi="Times New Roman" w:eastAsia="Times New Roman"/>
+                <w:b w:val="0"/>
+                <w:i w:val="0"/>
+                <w:sz w:val="16"/>
+              </w:rPr>
+            </w:r>
+            <w:r>
+              <w:rPr>
+                <w:rFonts w:ascii="Times New Roman" w:hAnsi="Times New Roman" w:eastAsia="Times New Roman"/>
+                <w:b w:val="0"/>
+                <w:i w:val="0"/>
+                <w:sz w:val="16"/>
+              </w:rPr>
+              <w:t>Tạo cấu trúc dữ liệu dùng chung: metadata file, phản hồi Server, trạng thái, mã lỗi; quy định cách gửi độ dài metadata; viết hàm đọc đủ số byte cần thiết</w:t>
+            </w:r>
+          </w:p>
+        </w:tc>
+        <w:tc>
+          <w:tcPr>
+            <w:tcW w:type="dxa" w:w="4762"/>
+            <w:vAlign w:val="center"/>
+            <w:tcMar>
+              <w:top w:w="80" w:type="dxa"/>
+              <w:start w:w="80" w:type="dxa"/>
+              <w:bottom w:w="80" w:type="dxa"/>
+              <w:end w:w="80" w:type="dxa"/>
+            </w:tcMar>
+            <w:tcBorders>
+              <w:top w:val="single" w:sz="6" w:space="0" w:color="7F7F7F"/>
+              <w:left w:val="single" w:sz="6" w:space="0" w:color="7F7F7F"/>
+              <w:bottom w:val="single" w:sz="6" w:space="0" w:color="7F7F7F"/>
+              <w:right w:val="single" w:sz="6" w:space="0" w:color="7F7F7F"/>
+              <w:insideH w:val="single" w:sz="6" w:space="0" w:color="7F7F7F"/>
+              <w:insideV w:val="single" w:sz="6" w:space="0" w:color="7F7F7F"/>
+            </w:tcBorders>
+          </w:tcPr>
+          <w:p>
+            <w:pPr>
+              <w:spacing w:after="0"/>
+              <w:jc w:val="left"/>
+            </w:pPr>
+            <w:r>
+              <w:rPr>
+                <w:rFonts w:ascii="Times New Roman" w:hAnsi="Times New Roman" w:eastAsia="Times New Roman"/>
+                <w:b w:val="0"/>
+                <w:i w:val="0"/>
+                <w:sz w:val="16"/>
+              </w:rPr>
+            </w:r>
+            <w:r>
+              <w:rPr>
+                <w:rFonts w:ascii="Times New Roman" w:hAnsi="Times New Roman" w:eastAsia="Times New Roman"/>
+                <w:b w:val="0"/>
+                <w:i w:val="0"/>
+                <w:sz w:val="16"/>
+              </w:rPr>
+              <w:t>Client và Server dùng chung một protocol; có request, response, enum và protocol helper</w:t>
+            </w:r>
+          </w:p>
+        </w:tc>
+      </w:tr>
+      <w:tr>
+        <w:tc>
+          <w:tcPr>
+            <w:tcW w:type="dxa" w:w="2381"/>
+            <w:vAlign w:val="center"/>
+            <w:tcMar>
+              <w:top w:w="80" w:type="dxa"/>
+              <w:start w:w="80" w:type="dxa"/>
+              <w:bottom w:w="80" w:type="dxa"/>
+              <w:end w:w="80" w:type="dxa"/>
+            </w:tcMar>
+            <w:tcBorders>
+              <w:top w:val="single" w:sz="6" w:space="0" w:color="7F7F7F"/>
+              <w:left w:val="single" w:sz="6" w:space="0" w:color="7F7F7F"/>
+              <w:bottom w:val="single" w:sz="6" w:space="0" w:color="7F7F7F"/>
+              <w:right w:val="single" w:sz="6" w:space="0" w:color="7F7F7F"/>
+              <w:insideH w:val="single" w:sz="6" w:space="0" w:color="7F7F7F"/>
+              <w:insideV w:val="single" w:sz="6" w:space="0" w:color="7F7F7F"/>
+            </w:tcBorders>
+          </w:tcPr>
+          <w:p>
+            <w:pPr>
+              <w:spacing w:after="0"/>
+              <w:jc w:val="left"/>
+            </w:pPr>
+            <w:r>
+              <w:rPr>
+                <w:rFonts w:ascii="Times New Roman" w:hAnsi="Times New Roman" w:eastAsia="Times New Roman"/>
+                <w:b w:val="0"/>
+                <w:i w:val="0"/>
+                <w:sz w:val="16"/>
+              </w:rPr>
+            </w:r>
+            <w:r>
+              <w:rPr>
+                <w:rFonts w:ascii="Times New Roman" w:hAnsi="Times New Roman" w:eastAsia="Times New Roman"/>
+                <w:b w:val="0"/>
+                <w:i w:val="0"/>
+                <w:sz w:val="16"/>
+              </w:rPr>
+              <w:t>Client WPF cơ bản và chọn file</w:t>
+            </w:r>
+          </w:p>
+        </w:tc>
+        <w:tc>
+          <w:tcPr>
+            <w:tcW w:type="dxa" w:w="6350"/>
+            <w:vAlign w:val="center"/>
+            <w:tcMar>
+              <w:top w:w="80" w:type="dxa"/>
+              <w:start w:w="80" w:type="dxa"/>
+              <w:bottom w:w="80" w:type="dxa"/>
+              <w:end w:w="80" w:type="dxa"/>
+            </w:tcMar>
+            <w:tcBorders>
+              <w:top w:val="single" w:sz="6" w:space="0" w:color="7F7F7F"/>
+              <w:left w:val="single" w:sz="6" w:space="0" w:color="7F7F7F"/>
+              <w:bottom w:val="single" w:sz="6" w:space="0" w:color="7F7F7F"/>
+              <w:right w:val="single" w:sz="6" w:space="0" w:color="7F7F7F"/>
+              <w:insideH w:val="single" w:sz="6" w:space="0" w:color="7F7F7F"/>
+              <w:insideV w:val="single" w:sz="6" w:space="0" w:color="7F7F7F"/>
+            </w:tcBorders>
+          </w:tcPr>
+          <w:p>
+            <w:pPr>
+              <w:spacing w:after="0"/>
+              <w:jc w:val="left"/>
+            </w:pPr>
+            <w:r>
+              <w:rPr>
+                <w:rFonts w:ascii="Times New Roman" w:hAnsi="Times New Roman" w:eastAsia="Times New Roman"/>
+                <w:b w:val="0"/>
+                <w:i w:val="0"/>
+                <w:sz w:val="16"/>
+              </w:rPr>
+            </w:r>
+            <w:r>
+              <w:rPr>
+                <w:rFonts w:ascii="Times New Roman" w:hAnsi="Times New Roman" w:eastAsia="Times New Roman"/>
+                <w:b w:val="0"/>
+                <w:i w:val="0"/>
+                <w:sz w:val="16"/>
+              </w:rPr>
+              <w:t>Tạo cửa sổ WPF; ô nhập IP và port; khu vực kéo thả; nút chọn file; hiển thị tên, đường dẫn và kích thước file; chưa cần upload nhiều file</w:t>
+            </w:r>
+          </w:p>
+        </w:tc>
+        <w:tc>
+          <w:tcPr>
+            <w:tcW w:type="dxa" w:w="4762"/>
+            <w:vAlign w:val="center"/>
+            <w:tcMar>
+              <w:top w:w="80" w:type="dxa"/>
+              <w:start w:w="80" w:type="dxa"/>
+              <w:bottom w:w="80" w:type="dxa"/>
+              <w:end w:w="80" w:type="dxa"/>
+            </w:tcMar>
+            <w:tcBorders>
+              <w:top w:val="single" w:sz="6" w:space="0" w:color="7F7F7F"/>
+              <w:left w:val="single" w:sz="6" w:space="0" w:color="7F7F7F"/>
+              <w:bottom w:val="single" w:sz="6" w:space="0" w:color="7F7F7F"/>
+              <w:right w:val="single" w:sz="6" w:space="0" w:color="7F7F7F"/>
+              <w:insideH w:val="single" w:sz="6" w:space="0" w:color="7F7F7F"/>
+              <w:insideV w:val="single" w:sz="6" w:space="0" w:color="7F7F7F"/>
+            </w:tcBorders>
+          </w:tcPr>
+          <w:p>
+            <w:pPr>
+              <w:spacing w:after="0"/>
+              <w:jc w:val="left"/>
+            </w:pPr>
+            <w:r>
+              <w:rPr>
+                <w:rFonts w:ascii="Times New Roman" w:hAnsi="Times New Roman" w:eastAsia="Times New Roman"/>
+                <w:b w:val="0"/>
+                <w:i w:val="0"/>
+                <w:sz w:val="16"/>
+              </w:rPr>
+            </w:r>
+            <w:r>
+              <w:rPr>
+                <w:rFonts w:ascii="Times New Roman" w:hAnsi="Times New Roman" w:eastAsia="Times New Roman"/>
+                <w:b w:val="0"/>
+                <w:i w:val="0"/>
+                <w:sz w:val="16"/>
+              </w:rPr>
+              <w:t>GUI Client mở được; kéo thả hoặc chọn được file; file được hiển thị trên giao diện</w:t>
+            </w:r>
+          </w:p>
+        </w:tc>
+      </w:tr>
+      <w:tr>
+        <w:tc>
+          <w:tcPr>
+            <w:tcW w:type="dxa" w:w="2381"/>
+            <w:vAlign w:val="center"/>
+            <w:tcMar>
+              <w:top w:w="80" w:type="dxa"/>
+              <w:start w:w="80" w:type="dxa"/>
+              <w:bottom w:w="80" w:type="dxa"/>
+              <w:end w:w="80" w:type="dxa"/>
+            </w:tcMar>
+            <w:tcBorders>
+              <w:top w:val="single" w:sz="6" w:space="0" w:color="7F7F7F"/>
+              <w:left w:val="single" w:sz="6" w:space="0" w:color="7F7F7F"/>
+              <w:bottom w:val="single" w:sz="6" w:space="0" w:color="7F7F7F"/>
+              <w:right w:val="single" w:sz="6" w:space="0" w:color="7F7F7F"/>
+              <w:insideH w:val="single" w:sz="6" w:space="0" w:color="7F7F7F"/>
+              <w:insideV w:val="single" w:sz="6" w:space="0" w:color="7F7F7F"/>
+            </w:tcBorders>
+          </w:tcPr>
+          <w:p>
+            <w:pPr>
+              <w:spacing w:after="0"/>
+              <w:jc w:val="left"/>
+            </w:pPr>
+            <w:r>
+              <w:rPr>
+                <w:rFonts w:ascii="Times New Roman" w:hAnsi="Times New Roman" w:eastAsia="Times New Roman"/>
+                <w:b w:val="0"/>
+                <w:i w:val="0"/>
+                <w:sz w:val="16"/>
+              </w:rPr>
+            </w:r>
+            <w:r>
+              <w:rPr>
+                <w:rFonts w:ascii="Times New Roman" w:hAnsi="Times New Roman" w:eastAsia="Times New Roman"/>
+                <w:b w:val="0"/>
+                <w:i w:val="0"/>
+                <w:sz w:val="16"/>
+              </w:rPr>
+              <w:t>Client gửi một file qua TCP</w:t>
+            </w:r>
+          </w:p>
+        </w:tc>
+        <w:tc>
+          <w:tcPr>
+            <w:tcW w:type="dxa" w:w="6350"/>
+            <w:vAlign w:val="center"/>
+            <w:tcMar>
+              <w:top w:w="80" w:type="dxa"/>
+              <w:start w:w="80" w:type="dxa"/>
+              <w:bottom w:w="80" w:type="dxa"/>
+              <w:end w:w="80" w:type="dxa"/>
+            </w:tcMar>
+            <w:tcBorders>
+              <w:top w:val="single" w:sz="6" w:space="0" w:color="7F7F7F"/>
+              <w:left w:val="single" w:sz="6" w:space="0" w:color="7F7F7F"/>
+              <w:bottom w:val="single" w:sz="6" w:space="0" w:color="7F7F7F"/>
+              <w:right w:val="single" w:sz="6" w:space="0" w:color="7F7F7F"/>
+              <w:insideH w:val="single" w:sz="6" w:space="0" w:color="7F7F7F"/>
+              <w:insideV w:val="single" w:sz="6" w:space="0" w:color="7F7F7F"/>
+            </w:tcBorders>
+          </w:tcPr>
+          <w:p>
+            <w:pPr>
+              <w:spacing w:after="0"/>
+              <w:jc w:val="left"/>
+            </w:pPr>
+            <w:r>
+              <w:rPr>
+                <w:rFonts w:ascii="Times New Roman" w:hAnsi="Times New Roman" w:eastAsia="Times New Roman"/>
+                <w:b w:val="0"/>
+                <w:i w:val="0"/>
+                <w:sz w:val="16"/>
+              </w:rPr>
+            </w:r>
+            <w:r>
+              <w:rPr>
+                <w:rFonts w:ascii="Times New Roman" w:hAnsi="Times New Roman" w:eastAsia="Times New Roman"/>
+                <w:b w:val="0"/>
+                <w:i w:val="0"/>
+                <w:sz w:val="16"/>
+              </w:rPr>
+              <w:t>Dùng TcpClient kết nối Server; gửi metadata; chờ phản hồi READY; đọc file theo chunk và gửi dữ liệu; nhận kết quả cuối từ Server; xử lý Server chưa bật hoặc sai port</w:t>
+            </w:r>
+          </w:p>
+        </w:tc>
+        <w:tc>
+          <w:tcPr>
+            <w:tcW w:type="dxa" w:w="4762"/>
+            <w:vAlign w:val="center"/>
+            <w:tcMar>
+              <w:top w:w="80" w:type="dxa"/>
+              <w:start w:w="80" w:type="dxa"/>
+              <w:bottom w:w="80" w:type="dxa"/>
+              <w:end w:w="80" w:type="dxa"/>
+            </w:tcMar>
+            <w:tcBorders>
+              <w:top w:val="single" w:sz="6" w:space="0" w:color="7F7F7F"/>
+              <w:left w:val="single" w:sz="6" w:space="0" w:color="7F7F7F"/>
+              <w:bottom w:val="single" w:sz="6" w:space="0" w:color="7F7F7F"/>
+              <w:right w:val="single" w:sz="6" w:space="0" w:color="7F7F7F"/>
+              <w:insideH w:val="single" w:sz="6" w:space="0" w:color="7F7F7F"/>
+              <w:insideV w:val="single" w:sz="6" w:space="0" w:color="7F7F7F"/>
+            </w:tcBorders>
+          </w:tcPr>
+          <w:p>
+            <w:pPr>
+              <w:spacing w:after="0"/>
+              <w:jc w:val="left"/>
+            </w:pPr>
+            <w:r>
+              <w:rPr>
+                <w:rFonts w:ascii="Times New Roman" w:hAnsi="Times New Roman" w:eastAsia="Times New Roman"/>
+                <w:b w:val="0"/>
+                <w:i w:val="0"/>
+                <w:sz w:val="16"/>
+              </w:rPr>
+            </w:r>
+            <w:r>
+              <w:rPr>
+                <w:rFonts w:ascii="Times New Roman" w:hAnsi="Times New Roman" w:eastAsia="Times New Roman"/>
+                <w:b w:val="0"/>
+                <w:i w:val="0"/>
+                <w:sz w:val="16"/>
+              </w:rPr>
+              <w:t>Client gửi được một file qua TCP; không đọc toàn bộ file vào RAM; hiển thị kết quả thành công hoặc lỗi cơ bản</w:t>
+            </w:r>
+          </w:p>
+        </w:tc>
+      </w:tr>
+      <w:tr>
+        <w:tc>
+          <w:tcPr>
+            <w:tcW w:type="dxa" w:w="2381"/>
+            <w:vAlign w:val="center"/>
+            <w:tcMar>
+              <w:top w:w="80" w:type="dxa"/>
+              <w:start w:w="80" w:type="dxa"/>
+              <w:bottom w:w="80" w:type="dxa"/>
+              <w:end w:w="80" w:type="dxa"/>
+            </w:tcMar>
+            <w:tcBorders>
+              <w:top w:val="single" w:sz="6" w:space="0" w:color="7F7F7F"/>
+              <w:left w:val="single" w:sz="6" w:space="0" w:color="7F7F7F"/>
+              <w:bottom w:val="single" w:sz="6" w:space="0" w:color="7F7F7F"/>
+              <w:right w:val="single" w:sz="6" w:space="0" w:color="7F7F7F"/>
+              <w:insideH w:val="single" w:sz="6" w:space="0" w:color="7F7F7F"/>
+              <w:insideV w:val="single" w:sz="6" w:space="0" w:color="7F7F7F"/>
+            </w:tcBorders>
+          </w:tcPr>
+          <w:p>
+            <w:pPr>
+              <w:spacing w:after="0"/>
+              <w:jc w:val="left"/>
+            </w:pPr>
+            <w:r>
+              <w:rPr>
+                <w:rFonts w:ascii="Times New Roman" w:hAnsi="Times New Roman" w:eastAsia="Times New Roman"/>
+                <w:b w:val="0"/>
+                <w:i w:val="0"/>
+                <w:sz w:val="16"/>
+              </w:rPr>
+            </w:r>
+            <w:r>
+              <w:rPr>
+                <w:rFonts w:ascii="Times New Roman" w:hAnsi="Times New Roman" w:eastAsia="Times New Roman"/>
+                <w:b w:val="0"/>
+                <w:i w:val="0"/>
+                <w:sz w:val="16"/>
+              </w:rPr>
+              <w:t>Server TCP và xử lý kết nối</w:t>
+            </w:r>
+          </w:p>
+        </w:tc>
+        <w:tc>
+          <w:tcPr>
+            <w:tcW w:type="dxa" w:w="6350"/>
+            <w:vAlign w:val="center"/>
+            <w:tcMar>
+              <w:top w:w="80" w:type="dxa"/>
+              <w:start w:w="80" w:type="dxa"/>
+              <w:bottom w:w="80" w:type="dxa"/>
+              <w:end w:w="80" w:type="dxa"/>
+            </w:tcMar>
+            <w:tcBorders>
+              <w:top w:val="single" w:sz="6" w:space="0" w:color="7F7F7F"/>
+              <w:left w:val="single" w:sz="6" w:space="0" w:color="7F7F7F"/>
+              <w:bottom w:val="single" w:sz="6" w:space="0" w:color="7F7F7F"/>
+              <w:right w:val="single" w:sz="6" w:space="0" w:color="7F7F7F"/>
+              <w:insideH w:val="single" w:sz="6" w:space="0" w:color="7F7F7F"/>
+              <w:insideV w:val="single" w:sz="6" w:space="0" w:color="7F7F7F"/>
+            </w:tcBorders>
+          </w:tcPr>
+          <w:p>
+            <w:pPr>
+              <w:spacing w:after="0"/>
+              <w:jc w:val="left"/>
+            </w:pPr>
+            <w:r>
+              <w:rPr>
+                <w:rFonts w:ascii="Times New Roman" w:hAnsi="Times New Roman" w:eastAsia="Times New Roman"/>
+                <w:b w:val="0"/>
+                <w:i w:val="0"/>
+                <w:sz w:val="16"/>
+              </w:rPr>
+            </w:r>
+            <w:r>
+              <w:rPr>
+                <w:rFonts w:ascii="Times New Roman" w:hAnsi="Times New Roman" w:eastAsia="Times New Roman"/>
+                <w:b w:val="0"/>
+                <w:i w:val="0"/>
+                <w:sz w:val="16"/>
+              </w:rPr>
+              <w:t>Khởi động TcpListener; lắng nghe port cấu hình; nhận Client; đọc metadata; kiểm tra tên và kích thước file; gửi READY, COMPLETED hoặc ERROR; không để một kết nối lỗi làm Server dừng</w:t>
+            </w:r>
+          </w:p>
+        </w:tc>
+        <w:tc>
+          <w:tcPr>
+            <w:tcW w:type="dxa" w:w="4762"/>
+            <w:vAlign w:val="center"/>
+            <w:tcMar>
+              <w:top w:w="80" w:type="dxa"/>
+              <w:start w:w="80" w:type="dxa"/>
+              <w:bottom w:w="80" w:type="dxa"/>
+              <w:end w:w="80" w:type="dxa"/>
+            </w:tcMar>
+            <w:tcBorders>
+              <w:top w:val="single" w:sz="6" w:space="0" w:color="7F7F7F"/>
+              <w:left w:val="single" w:sz="6" w:space="0" w:color="7F7F7F"/>
+              <w:bottom w:val="single" w:sz="6" w:space="0" w:color="7F7F7F"/>
+              <w:right w:val="single" w:sz="6" w:space="0" w:color="7F7F7F"/>
+              <w:insideH w:val="single" w:sz="6" w:space="0" w:color="7F7F7F"/>
+              <w:insideV w:val="single" w:sz="6" w:space="0" w:color="7F7F7F"/>
+            </w:tcBorders>
+          </w:tcPr>
+          <w:p>
+            <w:pPr>
+              <w:spacing w:after="0"/>
+              <w:jc w:val="left"/>
+            </w:pPr>
+            <w:r>
+              <w:rPr>
+                <w:rFonts w:ascii="Times New Roman" w:hAnsi="Times New Roman" w:eastAsia="Times New Roman"/>
+                <w:b w:val="0"/>
+                <w:i w:val="0"/>
+                <w:sz w:val="16"/>
+              </w:rPr>
+            </w:r>
+            <w:r>
+              <w:rPr>
+                <w:rFonts w:ascii="Times New Roman" w:hAnsi="Times New Roman" w:eastAsia="Times New Roman"/>
+                <w:b w:val="0"/>
+                <w:i w:val="0"/>
+                <w:sz w:val="16"/>
+              </w:rPr>
+              <w:t>Server mở port thành công; nhận được metadata; trả phản hồi đúng; tiếp tục chạy sau khi một Client lỗi</w:t>
+            </w:r>
+          </w:p>
+        </w:tc>
+      </w:tr>
+      <w:tr>
+        <w:tc>
+          <w:tcPr>
+            <w:tcW w:type="dxa" w:w="2381"/>
+            <w:vAlign w:val="center"/>
+            <w:tcMar>
+              <w:top w:w="80" w:type="dxa"/>
+              <w:start w:w="80" w:type="dxa"/>
+              <w:bottom w:w="80" w:type="dxa"/>
+              <w:end w:w="80" w:type="dxa"/>
+            </w:tcMar>
+            <w:tcBorders>
+              <w:top w:val="single" w:sz="6" w:space="0" w:color="7F7F7F"/>
+              <w:left w:val="single" w:sz="6" w:space="0" w:color="7F7F7F"/>
+              <w:bottom w:val="single" w:sz="6" w:space="0" w:color="7F7F7F"/>
+              <w:right w:val="single" w:sz="6" w:space="0" w:color="7F7F7F"/>
+              <w:insideH w:val="single" w:sz="6" w:space="0" w:color="7F7F7F"/>
+              <w:insideV w:val="single" w:sz="6" w:space="0" w:color="7F7F7F"/>
+            </w:tcBorders>
+          </w:tcPr>
+          <w:p>
+            <w:pPr>
+              <w:spacing w:after="0"/>
+              <w:jc w:val="left"/>
+            </w:pPr>
+            <w:r>
+              <w:rPr>
+                <w:rFonts w:ascii="Times New Roman" w:hAnsi="Times New Roman" w:eastAsia="Times New Roman"/>
+                <w:b w:val="0"/>
+                <w:i w:val="0"/>
+                <w:sz w:val="16"/>
+              </w:rPr>
+            </w:r>
+            <w:r>
+              <w:rPr>
+                <w:rFonts w:ascii="Times New Roman" w:hAnsi="Times New Roman" w:eastAsia="Times New Roman"/>
+                <w:b w:val="0"/>
+                <w:i w:val="0"/>
+                <w:sz w:val="16"/>
+              </w:rPr>
+              <w:t>Server lưu file, log và kiểm thử tích hợp</w:t>
+            </w:r>
+          </w:p>
+        </w:tc>
+        <w:tc>
+          <w:tcPr>
+            <w:tcW w:type="dxa" w:w="6350"/>
+            <w:vAlign w:val="center"/>
+            <w:tcMar>
+              <w:top w:w="80" w:type="dxa"/>
+              <w:start w:w="80" w:type="dxa"/>
+              <w:bottom w:w="80" w:type="dxa"/>
+              <w:end w:w="80" w:type="dxa"/>
+            </w:tcMar>
+            <w:tcBorders>
+              <w:top w:val="single" w:sz="6" w:space="0" w:color="7F7F7F"/>
+              <w:left w:val="single" w:sz="6" w:space="0" w:color="7F7F7F"/>
+              <w:bottom w:val="single" w:sz="6" w:space="0" w:color="7F7F7F"/>
+              <w:right w:val="single" w:sz="6" w:space="0" w:color="7F7F7F"/>
+              <w:insideH w:val="single" w:sz="6" w:space="0" w:color="7F7F7F"/>
+              <w:insideV w:val="single" w:sz="6" w:space="0" w:color="7F7F7F"/>
+            </w:tcBorders>
+          </w:tcPr>
+          <w:p>
+            <w:pPr>
+              <w:spacing w:after="0"/>
+              <w:jc w:val="left"/>
+            </w:pPr>
+            <w:r>
+              <w:rPr>
+                <w:rFonts w:ascii="Times New Roman" w:hAnsi="Times New Roman" w:eastAsia="Times New Roman"/>
+                <w:b w:val="0"/>
+                <w:i w:val="0"/>
+                <w:sz w:val="16"/>
+              </w:rPr>
+            </w:r>
+            <w:r>
+              <w:rPr>
+                <w:rFonts w:ascii="Times New Roman" w:hAnsi="Times New Roman" w:eastAsia="Times New Roman"/>
+                <w:b w:val="0"/>
+                <w:i w:val="0"/>
+                <w:sz w:val="16"/>
+              </w:rPr>
+              <w:t>Nhận dữ liệu từ connection handler; ghi file theo chunk vào thư mục Uploads; kiểm tra số byte; đóng tài nguyên; ghi log; tích hợp Client–Server; test file .txt, .png, .pdf, tên tiếng Việt và sai port</w:t>
+            </w:r>
+          </w:p>
+        </w:tc>
+        <w:tc>
+          <w:tcPr>
+            <w:tcW w:type="dxa" w:w="4762"/>
+            <w:vAlign w:val="center"/>
+            <w:tcMar>
+              <w:top w:w="80" w:type="dxa"/>
+              <w:start w:w="80" w:type="dxa"/>
+              <w:bottom w:w="80" w:type="dxa"/>
+              <w:end w:w="80" w:type="dxa"/>
+            </w:tcMar>
+            <w:tcBorders>
+              <w:top w:val="single" w:sz="6" w:space="0" w:color="7F7F7F"/>
+              <w:left w:val="single" w:sz="6" w:space="0" w:color="7F7F7F"/>
+              <w:bottom w:val="single" w:sz="6" w:space="0" w:color="7F7F7F"/>
+              <w:right w:val="single" w:sz="6" w:space="0" w:color="7F7F7F"/>
+              <w:insideH w:val="single" w:sz="6" w:space="0" w:color="7F7F7F"/>
+              <w:insideV w:val="single" w:sz="6" w:space="0" w:color="7F7F7F"/>
+            </w:tcBorders>
+          </w:tcPr>
+          <w:p>
+            <w:pPr>
+              <w:spacing w:after="0"/>
+              <w:jc w:val="left"/>
+            </w:pPr>
+            <w:r>
+              <w:rPr>
+                <w:rFonts w:ascii="Times New Roman" w:hAnsi="Times New Roman" w:eastAsia="Times New Roman"/>
+                <w:b w:val="0"/>
+                <w:i w:val="0"/>
+                <w:sz w:val="16"/>
+              </w:rPr>
+            </w:r>
+            <w:r>
+              <w:rPr>
+                <w:rFonts w:ascii="Times New Roman" w:hAnsi="Times New Roman" w:eastAsia="Times New Roman"/>
+                <w:b w:val="0"/>
+                <w:i w:val="0"/>
+                <w:sz w:val="16"/>
+              </w:rPr>
+              <w:t>Server lưu đúng file; kích thước gửi và nhận giống nhau; file mở được; có log, ảnh và bảng kiểm thử Tuần 1</w:t>
+            </w:r>
+          </w:p>
+        </w:tc>
+      </w:tr>
+    </w:tbl>
     <w:sectPr>
-      <w:pgSz w:w="11906" w:h="16838" w:orient="portrait"/>
-      <w:pgMar w:top="1440" w:right="1440" w:bottom="1440" w:left="1440" w:header="708" w:footer="708" w:gutter="0"/>
+      <w:pgSz w:w="16838" w:h="11906" w:orient="landscape"/>
+      <w:pgMar w:top="794" w:right="680" w:bottom="794" w:left="680" w:header="708" w:footer="708" w:gutter="0"/>
       <w:pgNumType/>
       <w:docGrid w:linePitch="360"/>
     </w:sectPr>

</xml_diff>